<commit_message>
Trails GM's Guide: worded as a companion book for running the game, open to all
Co-Authored-By: Claude Opus 5.5 <noreply@anthropic.com>
Claude-Session: https://claude.ai/code/session_015SADCFzhKijkC2foUmXrpC
</commit_message>
<xml_diff>
--- a/legend-dynamics/site/trails-of-blood-and-dust/Trails_of_Blood_Dust_GM_Guide.docx
+++ b/legend-dynamics/site/trails-of-blood-and-dust/Trails_of_Blood_Dust_GM_Guide.docx
@@ -133,7 +133,7 @@
         <w:pStyle w:val="FirstParagraph"/>
       </w:pPr>
       <w:r>
-        <w:t xml:space="preserve">This book is for the GM. It holds what the players’ characters don’t know yet: where jobs come from, what every monster fears and what its bite or curse does, the threats with their numbers, and how to use the GM view’s battle map and Encounter panel. The rules themselves are all in the</w:t>
+        <w:t xml:space="preserve">This book is for whoever runs the game, and anyone can read it. It gathers what the GM reaches for at the table: job seeds, the monsters’ weaknesses and what their bites and curses do, the threats with their numbers, and how to use the GM view’s battle map and Encounter panel. The rules themselves are in the</w:t>
       </w:r>
       <w:r>
         <w:t xml:space="preserve"> </w:t>
@@ -146,7 +146,7 @@
         <w:t xml:space="preserve">Players’ Guide</w:t>
       </w:r>
       <w:r>
-        <w:t xml:space="preserve">; this book only adds to them.</w:t>
+        <w:t xml:space="preserve">; this book builds on them.</w:t>
       </w:r>
     </w:p>
     <w:bookmarkStart w:id="21" w:name="running-jobs"/>
@@ -2406,7 +2406,7 @@
         <w:pStyle w:val="FirstParagraph"/>
       </w:pPr>
       <w:r>
-        <w:t xml:space="preserve">These are the secrets of the monsters in</w:t>
+        <w:t xml:space="preserve">The details behind</w:t>
       </w:r>
       <w:r>
         <w:t xml:space="preserve"> </w:t>
@@ -2422,7 +2422,7 @@
         <w:t xml:space="preserve"> </w:t>
       </w:r>
       <w:r>
-        <w:t xml:space="preserve">in the Players’ Guide. Hand them out as the characters learn them: an Occult roll, a Sighted character’s Monster’s Eye, a survivor’s story, or the hard way.</w:t>
+        <w:t xml:space="preserve">in the Players’ Guide: what each monster fears, and what its bite or curse does. In the story, hunters learn these the hard way: an Occult roll, a Sighted character’s Monster’s Eye, a survivor’s tale, or a fight that goes wrong.</w:t>
       </w:r>
     </w:p>
     <w:bookmarkStart w:id="22" w:name="weaknesses"/>

</xml_diff>

<commit_message>
Rebuild the Cloudflare site for the balance revision, Move, reach and range
Co-Authored-By: Claude Opus 5.5 <noreply@anthropic.com>
Claude-Session: https://claude.ai/code/session_015SADCFzhKijkC2foUmXrpC
</commit_message>
<xml_diff>
--- a/legend-dynamics/site/trails-of-blood-and-dust/Trails_of_Blood_Dust_GM_Guide.docx
+++ b/legend-dynamics/site/trails-of-blood-and-dust/Trails_of_Blood_Dust_GM_Guide.docx
@@ -3072,7 +3072,7 @@
               <w:rPr>
                 <w:sz w:val="19"/>
               </w:rPr>
-              <w:t xml:space="preserve">A called shot with a stake at the heart (a telling hit pins it); hunting it by day; refusing it entry.</w:t>
+              <w:t xml:space="preserve">A called shot with a stake at the heart: its weakness, which incapacitates it (an established weakness, not a telling-hit pin); hunting it by day; refusing it entry.</w:t>
             </w:r>
           </w:p>
         </w:tc>
@@ -5810,7 +5810,7 @@
         <w:t xml:space="preserve"> </w:t>
       </w:r>
       <w:r>
-        <w:t xml:space="preserve">rules and shows every roll. Add characters from the GM view and opponents from the Threats table (or make one up on the spot), then start: it keeps the turn order by Agility, and for each attack works out the range, the defense (Dodge, Parry or Block, one a round), the boxes marked and any telling hit, offering a Grit point choices at the moment they apply. Hits land on the character cards and the battle map, and with gritty combat on, grievous wounds are rolled and kept. The panel keeps a log and a summary of the fight, which can be saved to a file. It’s a helper, not a rule: the GM can rule any result differently, and the log says so. For each attack, choose what it’s made of (silver, cold iron, a wooden stake or fire), and the panel applies the rules that turn on it: a shapechanger’s Tough in their form (and what gets past it), a weakness that marks one box more, and a creature only the right weapon can hurt.</w:t>
+        <w:t xml:space="preserve">rules and shows every roll. Add characters from the GM view and opponents from the Threats table (or make one up on the spot), then start: it keeps the turn order by Agility, and for each attack works out the range, the defense (Dodge, Parry or Block, one a round, and a second at −2 with Additional Defense), the boxes marked and any telling hit, offering a Grit point choices at the moment they apply. Hits land on the character cards and the battle map, and with gritty combat on, grievous wounds are rolled and kept. The panel keeps a log and a summary of the fight, which can be saved to a file. It’s a helper, not a rule: the GM can rule any result differently, and the log says so. For each attack, choose what it’s made of (silver, cold iron, a wooden stake or fire), and the panel applies the rules that turn on it: a shapechanger’s Tough in their form (and what gets past it), a weakness that marks one box more, and a creature only the right weapon can hurt.</w:t>
       </w:r>
     </w:p>
     <w:bookmarkEnd w:id="28"/>

</xml_diff>

<commit_message>
Trails: lore cards get a chapter of their own in both guides
Players' Guide: a "Lore cards" chapter, between Running jobs and
Monsters and magic, holds Folklore, truth and lore cards and the
discovery and lore-card rules (discovery.chapter); Actions and teamwork
keeps a one-line pointer. GM's Guide: a "Lore cards" chapter holds the
lore card subjects (renamed from "Lore cards" to avoid two headings of
the same name) and the Discovery panel. Both show in the contents and as
Word headings. Other settings are unchanged.

Co-Authored-By: Claude Opus 5.5 <noreply@anthropic.com>
Claude-Session: https://claude.ai/code/session_015SADCFzhKijkC2foUmXrpC
</commit_message>
<xml_diff>
--- a/legend-dynamics/site/trails-of-blood-and-dust/Trails_of_Blood_Dust_GM_Guide.docx
+++ b/legend-dynamics/site/trails-of-blood-and-dust/Trails_of_Blood_Dust_GM_Guide.docx
@@ -2392,7 +2392,7 @@
     </w:tbl>
     <w:bookmarkEnd w:id="20"/>
     <w:bookmarkEnd w:id="21"/>
-    <w:bookmarkStart w:id="31" w:name="monsters"/>
+    <w:bookmarkStart w:id="30" w:name="monsters"/>
     <w:p>
       <w:pPr>
         <w:pStyle w:val="Heading1"/>
@@ -2422,7 +2422,7 @@
         <w:t xml:space="preserve"> </w:t>
       </w:r>
       <w:r>
-        <w:t xml:space="preserve">in the Players’ Guide: what each monster fears, what a lore card for it records, what its bite or curse does, and the rulings for vampires, the wendigo, hellhounds, the shadow realm and demons. In the story, hunters learn these a piece at a time: a discovery clock, a survivor’s tale, a test that works, or a fight that goes wrong.</w:t>
+        <w:t xml:space="preserve">in the Players’ Guide: what each monster fears, what its bite or curse does, and the rulings for vampires, the wendigo, hellhounds, the shadow realm and demons. In the story, hunters learn these a piece at a time: a discovery clock, a survivor’s tale, a test that works, or a fight that goes wrong.</w:t>
       </w:r>
     </w:p>
     <w:bookmarkStart w:id="22" w:name="weaknesses"/>
@@ -2992,13 +2992,875 @@
       </w:tr>
     </w:tbl>
     <w:bookmarkEnd w:id="22"/>
-    <w:bookmarkStart w:id="23" w:name="lore-cards"/>
+    <w:bookmarkStart w:id="23" w:name="bites-and-curses"/>
     <w:p>
       <w:pPr>
         <w:pStyle w:val="Heading2"/>
       </w:pPr>
       <w:r>
+        <w:t xml:space="preserve">Bites and curses</w:t>
+      </w:r>
+    </w:p>
+    <w:p>
+      <w:pPr>
+        <w:numPr>
+          <w:ilvl w:val="0"/>
+          <w:numId w:val="1001"/>
+        </w:numPr>
+        <w:pStyle w:val="Compact"/>
+      </w:pPr>
+      <w:r>
+        <w:rPr>
+          <w:bCs/>
+          <w:b/>
+        </w:rPr>
+        <w:t xml:space="preserve">Zombie bite.</w:t>
+      </w:r>
+      <w:r>
+        <w:t xml:space="preserve"> </w:t>
+      </w:r>
+      <w:r>
+        <w:t xml:space="preserve">A bite that marks a box starts a 4-segment</w:t>
+      </w:r>
+      <w:r>
+        <w:t xml:space="preserve"> </w:t>
+      </w:r>
+      <w:r>
+        <w:rPr>
+          <w:bCs/>
+          <w:b/>
+        </w:rPr>
+        <w:t xml:space="preserve">Infection</w:t>
+      </w:r>
+      <w:r>
+        <w:t xml:space="preserve"> </w:t>
+      </w:r>
+      <w:r>
+        <w:t xml:space="preserve">clock, ticking each hour. A successful Medicine roll with an Occult remedy stops it; when it fills, you die, and rise.</w:t>
+      </w:r>
+    </w:p>
+    <w:p>
+      <w:pPr>
+        <w:numPr>
+          <w:ilvl w:val="0"/>
+          <w:numId w:val="1001"/>
+        </w:numPr>
+        <w:pStyle w:val="Compact"/>
+      </w:pPr>
+      <w:r>
+        <w:rPr>
+          <w:bCs/>
+          <w:b/>
+        </w:rPr>
+        <w:t xml:space="preserve">Werewolf bite.</w:t>
+      </w:r>
+      <w:r>
+        <w:t xml:space="preserve"> </w:t>
+      </w:r>
+      <w:r>
+        <w:t xml:space="preserve">A bite under the full moon can pass on the curse; the GM decides, and lifting it is a major ritual.</w:t>
+      </w:r>
+    </w:p>
+    <w:p>
+      <w:pPr>
+        <w:numPr>
+          <w:ilvl w:val="0"/>
+          <w:numId w:val="1001"/>
+        </w:numPr>
+        <w:pStyle w:val="Compact"/>
+      </w:pPr>
+      <w:r>
+        <w:rPr>
+          <w:bCs/>
+          <w:b/>
+        </w:rPr>
+        <w:t xml:space="preserve">Vampire bite.</w:t>
+      </w:r>
+      <w:r>
+        <w:t xml:space="preserve"> </w:t>
+      </w:r>
+      <w:r>
+        <w:t xml:space="preserve">A vampire who drains a victim to Dying can choose to turn them. The turned belong to its lineage (see</w:t>
+      </w:r>
+      <w:r>
+        <w:t xml:space="preserve"> </w:t>
+      </w:r>
+      <w:r>
+        <w:rPr>
+          <w:iCs/>
+          <w:i/>
+        </w:rPr>
+        <w:t xml:space="preserve">Vampires</w:t>
+      </w:r>
+      <w:r>
+        <w:t xml:space="preserve">).</w:t>
+      </w:r>
+    </w:p>
+    <w:p>
+      <w:pPr>
+        <w:numPr>
+          <w:ilvl w:val="0"/>
+          <w:numId w:val="1001"/>
+        </w:numPr>
+        <w:pStyle w:val="Compact"/>
+      </w:pPr>
+      <w:r>
+        <w:rPr>
+          <w:bCs/>
+          <w:b/>
+        </w:rPr>
+        <w:t xml:space="preserve">The wendigo’s hunger.</w:t>
+      </w:r>
+      <w:r>
+        <w:t xml:space="preserve"> </w:t>
+      </w:r>
+      <w:r>
+        <w:t xml:space="preserve">It begins with someone who ate human flesh to survive a starving winter in the high passes. A character who does starts a 4-segment</w:t>
+      </w:r>
+      <w:r>
+        <w:t xml:space="preserve"> </w:t>
+      </w:r>
+      <w:r>
+        <w:rPr>
+          <w:bCs/>
+          <w:b/>
+        </w:rPr>
+        <w:t xml:space="preserve">Hunger</w:t>
+      </w:r>
+      <w:r>
+        <w:t xml:space="preserve"> </w:t>
+      </w:r>
+      <w:r>
+        <w:t xml:space="preserve">clock, ticking each week they go without it again; when it fills, they belong to the wendigo. Only a major ritual lifts it.</w:t>
+      </w:r>
+    </w:p>
+    <w:p>
+      <w:pPr>
+        <w:numPr>
+          <w:ilvl w:val="0"/>
+          <w:numId w:val="1001"/>
+        </w:numPr>
+        <w:pStyle w:val="Compact"/>
+      </w:pPr>
+      <w:r>
+        <w:rPr>
+          <w:bCs/>
+          <w:b/>
+        </w:rPr>
+        <w:t xml:space="preserve">A wraith’s touch.</w:t>
+      </w:r>
+      <w:r>
+        <w:t xml:space="preserve"> </w:t>
+      </w:r>
+      <w:r>
+        <w:t xml:space="preserve">Someone killed by it rises as a wraith at the next new moon, unless they’re buried with salt in the coffin.</w:t>
+      </w:r>
+    </w:p>
+    <w:p>
+      <w:pPr>
+        <w:numPr>
+          <w:ilvl w:val="0"/>
+          <w:numId w:val="1001"/>
+        </w:numPr>
+        <w:pStyle w:val="Compact"/>
+      </w:pPr>
+      <w:r>
+        <w:rPr>
+          <w:bCs/>
+          <w:b/>
+        </w:rPr>
+        <w:t xml:space="preserve">A banshee’s keening.</w:t>
+      </w:r>
+      <w:r>
+        <w:t xml:space="preserve"> </w:t>
+      </w:r>
+      <w:r>
+        <w:t xml:space="preserve">She is tied to a family’s blood, not a place: once she has keened for one of a line, she can follow that family from town to town.</w:t>
+      </w:r>
+    </w:p>
+    <w:bookmarkEnd w:id="23"/>
+    <w:bookmarkStart w:id="24" w:name="vampires"/>
+    <w:p>
+      <w:pPr>
+        <w:pStyle w:val="Heading2"/>
+      </w:pPr>
+      <w:r>
+        <w:t xml:space="preserve">Vampires</w:t>
+      </w:r>
+    </w:p>
+    <w:p>
+      <w:pPr>
+        <w:numPr>
+          <w:ilvl w:val="0"/>
+          <w:numId w:val="1002"/>
+        </w:numPr>
+        <w:pStyle w:val="Compact"/>
+      </w:pPr>
+      <w:r>
+        <w:rPr>
+          <w:bCs/>
+          <w:b/>
+        </w:rPr>
+        <w:t xml:space="preserve">Lineages.</w:t>
+      </w:r>
+      <w:r>
+        <w:t xml:space="preserve"> </w:t>
+      </w:r>
+      <w:r>
+        <w:t xml:space="preserve">Each</w:t>
+      </w:r>
+      <w:r>
+        <w:t xml:space="preserve"> </w:t>
+      </w:r>
+      <w:r>
+        <w:rPr>
+          <w:bCs/>
+          <w:b/>
+        </w:rPr>
+        <w:t xml:space="preserve">natural vampire</w:t>
+      </w:r>
+      <w:r>
+        <w:t xml:space="preserve"> </w:t>
+      </w:r>
+      <w:r>
+        <w:t xml:space="preserve">sustains its own lineage: everyone it has turned, and everyone they have turned in turn. There is more than one natural vampire.</w:t>
+      </w:r>
+    </w:p>
+    <w:p>
+      <w:pPr>
+        <w:numPr>
+          <w:ilvl w:val="0"/>
+          <w:numId w:val="1002"/>
+        </w:numPr>
+        <w:pStyle w:val="Compact"/>
+      </w:pPr>
+      <w:r>
+        <w:rPr>
+          <w:bCs/>
+          <w:b/>
+        </w:rPr>
+        <w:t xml:space="preserve">Freeing a lineage.</w:t>
+      </w:r>
+      <w:r>
+        <w:t xml:space="preserve"> </w:t>
+      </w:r>
+      <w:r>
+        <w:t xml:space="preserve">Destroy the natural source, and the whole chain reverts to human, including those infected only indirectly. Destroying a vampire it turned (an intermediate) cures nobody.</w:t>
+      </w:r>
+    </w:p>
+    <w:p>
+      <w:pPr>
+        <w:numPr>
+          <w:ilvl w:val="0"/>
+          <w:numId w:val="1002"/>
+        </w:numPr>
+        <w:pStyle w:val="Compact"/>
+      </w:pPr>
+      <w:r>
+        <w:rPr>
+          <w:bCs/>
+          <w:b/>
+        </w:rPr>
+        <w:t xml:space="preserve">A stake isn’t the end.</w:t>
+      </w:r>
+      <w:r>
+        <w:t xml:space="preserve"> </w:t>
+      </w:r>
+      <w:r>
+        <w:t xml:space="preserve">A stake through the heart incapacitates a vampire; it doesn’t destroy it. Staking the source doesn’t free its lineage; destroying it does.</w:t>
+      </w:r>
+    </w:p>
+    <w:p>
+      <w:pPr>
+        <w:numPr>
+          <w:ilvl w:val="0"/>
+          <w:numId w:val="1002"/>
+        </w:numPr>
+        <w:pStyle w:val="Compact"/>
+      </w:pPr>
+      <w:r>
+        <w:rPr>
+          <w:bCs/>
+          <w:b/>
+        </w:rPr>
+        <w:t xml:space="preserve">What reversion does to the body.</w:t>
+      </w:r>
+      <w:r>
+        <w:t xml:space="preserve"> </w:t>
+      </w:r>
+      <w:r>
+        <w:t xml:space="preserve">Wounds that vampiric regeneration already healed stay healed. Wounds that hadn’t healed remain, and have their ordinary human consequences at once: someone reverting with three boxes marked is Dying. Reversion itself repairs nothing.</w:t>
+      </w:r>
+    </w:p>
+    <w:p>
+      <w:pPr>
+        <w:numPr>
+          <w:ilvl w:val="0"/>
+          <w:numId w:val="1002"/>
+        </w:numPr>
+        <w:pStyle w:val="Compact"/>
+      </w:pPr>
+      <w:r>
+        <w:t xml:space="preserve">This cure is a vampire’s alone: no other creature’s victims are freed by killing their maker.</w:t>
+      </w:r>
+    </w:p>
+    <w:bookmarkEnd w:id="24"/>
+    <w:bookmarkStart w:id="25" w:name="the-wendigo"/>
+    <w:p>
+      <w:pPr>
+        <w:pStyle w:val="Heading2"/>
+      </w:pPr>
+      <w:r>
+        <w:t xml:space="preserve">The wendigo</w:t>
+      </w:r>
+    </w:p>
+    <w:p>
+      <w:pPr>
+        <w:numPr>
+          <w:ilvl w:val="0"/>
+          <w:numId w:val="1003"/>
+        </w:numPr>
+        <w:pStyle w:val="Compact"/>
+      </w:pPr>
+      <w:r>
+        <w:t xml:space="preserve">Ordinary weapons wound it; only fire marks more than 1 box at a time.</w:t>
+      </w:r>
+    </w:p>
+    <w:p>
+      <w:pPr>
+        <w:numPr>
+          <w:ilvl w:val="0"/>
+          <w:numId w:val="1003"/>
+        </w:numPr>
+        <w:pStyle w:val="Compact"/>
+      </w:pPr>
+      <w:r>
+        <w:t xml:space="preserve">It heals unnaturally fast, and only fire interferes with that healing.</w:t>
+      </w:r>
+    </w:p>
+    <w:p>
+      <w:pPr>
+        <w:numPr>
+          <w:ilvl w:val="0"/>
+          <w:numId w:val="1003"/>
+        </w:numPr>
+        <w:pStyle w:val="Compact"/>
+      </w:pPr>
+      <w:r>
+        <w:t xml:space="preserve">It is destroyed for good only when it is</w:t>
+      </w:r>
+      <w:r>
+        <w:t xml:space="preserve"> </w:t>
+      </w:r>
+      <w:r>
+        <w:rPr>
+          <w:bCs/>
+          <w:b/>
+        </w:rPr>
+        <w:t xml:space="preserve">beheaded and its body burned</w:t>
+      </w:r>
+      <w:r>
+        <w:t xml:space="preserve">. After beheading, the body can still lash out, but blindly: its actions have no direction.</w:t>
+      </w:r>
+    </w:p>
+    <w:p>
+      <w:pPr>
+        <w:numPr>
+          <w:ilvl w:val="0"/>
+          <w:numId w:val="1003"/>
+        </w:numPr>
+        <w:pStyle w:val="Compact"/>
+      </w:pPr>
+      <w:r>
+        <w:t xml:space="preserve">How fast it heals, how long fire holds the healing back, and how the headless body’s blind attacks are run are not yet set; until they are, the GM rules.</w:t>
+      </w:r>
+    </w:p>
+    <w:bookmarkEnd w:id="25"/>
+    <w:bookmarkStart w:id="26" w:name="hellhounds"/>
+    <w:p>
+      <w:pPr>
+        <w:pStyle w:val="Heading2"/>
+      </w:pPr>
+      <w:r>
+        <w:t xml:space="preserve">Hellhounds</w:t>
+      </w:r>
+    </w:p>
+    <w:p>
+      <w:pPr>
+        <w:numPr>
+          <w:ilvl w:val="0"/>
+          <w:numId w:val="1004"/>
+        </w:numPr>
+        <w:pStyle w:val="Compact"/>
+      </w:pPr>
+      <w:r>
+        <w:t xml:space="preserve">A hellhound’s hunt is a</w:t>
+      </w:r>
+      <w:r>
+        <w:t xml:space="preserve"> </w:t>
+      </w:r>
+      <w:r>
+        <w:rPr>
+          <w:bCs/>
+          <w:b/>
+        </w:rPr>
+        <w:t xml:space="preserve">curse tied to a claim on someone’s soul</w:t>
+      </w:r>
+      <w:r>
+        <w:t xml:space="preserve">.</w:t>
+      </w:r>
+    </w:p>
+    <w:p>
+      <w:pPr>
+        <w:numPr>
+          <w:ilvl w:val="0"/>
+          <w:numId w:val="1004"/>
+        </w:numPr>
+        <w:pStyle w:val="Compact"/>
+      </w:pPr>
+      <w:r>
+        <w:t xml:space="preserve">The hunt ends only when the conditions behind the claim are</w:t>
+      </w:r>
+      <w:r>
+        <w:t xml:space="preserve"> </w:t>
+      </w:r>
+      <w:r>
+        <w:rPr>
+          <w:bCs/>
+          <w:b/>
+        </w:rPr>
+        <w:t xml:space="preserve">resolved or changed</w:t>
+      </w:r>
+      <w:r>
+        <w:t xml:space="preserve">. A powerful practitioner can interfere with the pact through a</w:t>
+      </w:r>
+      <w:r>
+        <w:t xml:space="preserve"> </w:t>
+      </w:r>
+      <w:r>
+        <w:rPr>
+          <w:bCs/>
+          <w:b/>
+        </w:rPr>
+        <w:t xml:space="preserve">major ritual</w:t>
+      </w:r>
+      <w:r>
+        <w:t xml:space="preserve">.</w:t>
+      </w:r>
+    </w:p>
+    <w:p>
+      <w:pPr>
+        <w:numPr>
+          <w:ilvl w:val="0"/>
+          <w:numId w:val="1004"/>
+        </w:numPr>
+        <w:pStyle w:val="Compact"/>
+      </w:pPr>
+      <w:r>
+        <w:rPr>
+          <w:bCs/>
+          <w:b/>
+        </w:rPr>
+        <w:t xml:space="preserve">Holy water</w:t>
+      </w:r>
+      <w:r>
+        <w:t xml:space="preserve"> </w:t>
+      </w:r>
+      <w:r>
+        <w:t xml:space="preserve">drives a hellhound off and protects its quarry for a time; it doesn’t cancel the pact.</w:t>
+      </w:r>
+    </w:p>
+    <w:p>
+      <w:pPr>
+        <w:numPr>
+          <w:ilvl w:val="0"/>
+          <w:numId w:val="1004"/>
+        </w:numPr>
+        <w:pStyle w:val="Compact"/>
+      </w:pPr>
+      <w:r>
+        <w:t xml:space="preserve">Whether destroying a hellhound’s physical body buys the quarry time, and how much, is not settled: the GM rules case by case.</w:t>
+      </w:r>
+    </w:p>
+    <w:bookmarkEnd w:id="26"/>
+    <w:bookmarkStart w:id="27" w:name="the-shadow-realm"/>
+    <w:p>
+      <w:pPr>
+        <w:pStyle w:val="Heading2"/>
+      </w:pPr>
+      <w:r>
+        <w:t xml:space="preserve">The shadow realm</w:t>
+      </w:r>
+    </w:p>
+    <w:p>
+      <w:pPr>
+        <w:pStyle w:val="FirstParagraph"/>
+      </w:pPr>
+      <w:r>
+        <w:t xml:space="preserve">The</w:t>
+      </w:r>
+      <w:r>
+        <w:t xml:space="preserve"> </w:t>
+      </w:r>
+      <w:r>
+        <w:rPr>
+          <w:bCs/>
+          <w:b/>
+        </w:rPr>
+        <w:t xml:space="preserve">shadow realm</w:t>
+      </w:r>
+      <w:r>
+        <w:t xml:space="preserve"> </w:t>
+      </w:r>
+      <w:r>
+        <w:t xml:space="preserve">is a real place in the same world as ours, not another Earth: it has no copies of our towns or our people. It is an independent and brutal ecology, with its own hunters and prey. Some of its creatures cross over, and some of those spread a</w:t>
+      </w:r>
+      <w:r>
+        <w:t xml:space="preserve"> </w:t>
+      </w:r>
+      <w:r>
+        <w:rPr>
+          <w:bCs/>
+          <w:b/>
+        </w:rPr>
+        <w:t xml:space="preserve">contagion</w:t>
+      </w:r>
+      <w:r>
+        <w:t xml:space="preserve"> </w:t>
+      </w:r>
+      <w:r>
+        <w:t xml:space="preserve">(a bite, a curse) that makes more of their kind; others never do. Each threat has its own weaknesses, found out on their own terms: not every horror is an infection.</w:t>
+      </w:r>
+    </w:p>
+    <w:p>
+      <w:pPr>
+        <w:pStyle w:val="BodyText"/>
+      </w:pPr>
+      <w:r>
+        <w:t xml:space="preserve">Some hold that the things of the dark are</w:t>
+      </w:r>
+      <w:r>
+        <w:t xml:space="preserve"> </w:t>
+      </w:r>
+      <w:r>
+        <w:rPr>
+          <w:bCs/>
+          <w:b/>
+        </w:rPr>
+        <w:t xml:space="preserve">fallen angels</w:t>
+      </w:r>
+      <w:r>
+        <w:t xml:space="preserve"> </w:t>
+      </w:r>
+      <w:r>
+        <w:t xml:space="preserve">and their brood. Others call that a preacher’s story. No one has settled it, and the game doesn’t.</w:t>
+      </w:r>
+    </w:p>
+    <w:bookmarkEnd w:id="27"/>
+    <w:bookmarkStart w:id="28" w:name="demons"/>
+    <w:p>
+      <w:pPr>
+        <w:pStyle w:val="Heading2"/>
+      </w:pPr>
+      <w:r>
+        <w:t xml:space="preserve">Demons</w:t>
+      </w:r>
+    </w:p>
+    <w:p>
+      <w:pPr>
+        <w:pStyle w:val="FirstParagraph"/>
+      </w:pPr>
+      <w:r>
+        <w:t xml:space="preserve">Three kinds of thing get called a demon, and they aren’t the same:</w:t>
+      </w:r>
+    </w:p>
+    <w:p>
+      <w:pPr>
+        <w:numPr>
+          <w:ilvl w:val="0"/>
+          <w:numId w:val="1005"/>
+        </w:numPr>
+        <w:pStyle w:val="Compact"/>
+      </w:pPr>
+      <w:r>
+        <w:rPr>
+          <w:bCs/>
+          <w:b/>
+        </w:rPr>
+        <w:t xml:space="preserve">Demonic creatures</w:t>
+      </w:r>
+      <w:r>
+        <w:t xml:space="preserve"> </w:t>
+      </w:r>
+      <w:r>
+        <w:t xml:space="preserve">native to the shadow realm: beasts and hunters of that ecology.</w:t>
+      </w:r>
+    </w:p>
+    <w:p>
+      <w:pPr>
+        <w:numPr>
+          <w:ilvl w:val="0"/>
+          <w:numId w:val="1005"/>
+        </w:numPr>
+        <w:pStyle w:val="Compact"/>
+      </w:pPr>
+      <w:r>
+        <w:rPr>
+          <w:bCs/>
+          <w:b/>
+        </w:rPr>
+        <w:t xml:space="preserve">Creatures under demonic influence</w:t>
+      </w:r>
+      <w:r>
+        <w:t xml:space="preserve">: something, or someone, bent by a demon’s power.</w:t>
+      </w:r>
+    </w:p>
+    <w:p>
+      <w:pPr>
+        <w:numPr>
+          <w:ilvl w:val="0"/>
+          <w:numId w:val="1005"/>
+        </w:numPr>
+        <w:pStyle w:val="Compact"/>
+      </w:pPr>
+      <w:r>
+        <w:rPr>
+          <w:bCs/>
+          <w:b/>
+        </w:rPr>
+        <w:t xml:space="preserve">True demons</w:t>
+      </w:r>
+      <w:r>
+        <w:t xml:space="preserve">, native to the deeper</w:t>
+      </w:r>
+      <w:r>
+        <w:t xml:space="preserve"> </w:t>
+      </w:r>
+      <w:r>
+        <w:rPr>
+          <w:bCs/>
+          <w:b/>
+        </w:rPr>
+        <w:t xml:space="preserve">Abyss</w:t>
+      </w:r>
+      <w:r>
+        <w:t xml:space="preserve">: a realm of no light and of eldritch powers, not a fiery hell. A true demon isn’t a creature of fire.</w:t>
+      </w:r>
+    </w:p>
+    <w:p>
+      <w:pPr>
+        <w:pStyle w:val="FirstParagraph"/>
+      </w:pPr>
+      <w:r>
+        <w:t xml:space="preserve">A</w:t>
+      </w:r>
+      <w:r>
+        <w:t xml:space="preserve"> </w:t>
+      </w:r>
+      <w:r>
+        <w:rPr>
+          <w:bCs/>
+          <w:b/>
+        </w:rPr>
+        <w:t xml:space="preserve">true demon can’t enter our world unaided</w:t>
+      </w:r>
+      <w:r>
+        <w:t xml:space="preserve">: it must be</w:t>
+      </w:r>
+      <w:r>
+        <w:t xml:space="preserve"> </w:t>
+      </w:r>
+      <w:r>
+        <w:rPr>
+          <w:bCs/>
+          <w:b/>
+        </w:rPr>
+        <w:t xml:space="preserve">summoned</w:t>
+      </w:r>
+      <w:r>
+        <w:t xml:space="preserve">, or come through a</w:t>
+      </w:r>
+      <w:r>
+        <w:t xml:space="preserve"> </w:t>
+      </w:r>
+      <w:r>
+        <w:rPr>
+          <w:bCs/>
+          <w:b/>
+        </w:rPr>
+        <w:t xml:space="preserve">possession</w:t>
+      </w:r>
+      <w:r>
+        <w:t xml:space="preserve">. A person can be possessed only if they are corrupted and have no faith of any kind at all. True demons are exceptionally powerful, and a generic fight is not how they are met: the encounter is a</w:t>
+      </w:r>
+      <w:r>
+        <w:t xml:space="preserve"> </w:t>
+      </w:r>
+      <w:r>
+        <w:rPr>
+          <w:bCs/>
+          <w:b/>
+        </w:rPr>
+        <w:t xml:space="preserve">ritual or a negotiation</w:t>
+      </w:r>
+      <w:r>
+        <w:t xml:space="preserve">, and the countermeasures are major rituals and powerful holy talismans.</w:t>
+      </w:r>
+    </w:p>
+    <w:p>
+      <w:pPr>
+        <w:numPr>
+          <w:ilvl w:val="0"/>
+          <w:numId w:val="1006"/>
+        </w:numPr>
+        <w:pStyle w:val="Compact"/>
+      </w:pPr>
+      <w:r>
+        <w:rPr>
+          <w:bCs/>
+          <w:b/>
+        </w:rPr>
+        <w:t xml:space="preserve">Banishment by a talisman.</w:t>
+      </w:r>
+      <w:r>
+        <w:t xml:space="preserve"> </w:t>
+      </w:r>
+      <w:r>
+        <w:t xml:space="preserve">A sufficiently powerful holy talisman can banish a demon by breaking its binding to our world. What happens to the host depends on the talisman and how it acts: a holy sword that fatally wounds the host banishes the demon and kills the host.</w:t>
+      </w:r>
+    </w:p>
+    <w:p>
+      <w:pPr>
+        <w:numPr>
+          <w:ilvl w:val="0"/>
+          <w:numId w:val="1006"/>
+        </w:numPr>
+        <w:pStyle w:val="Compact"/>
+      </w:pPr>
+      <w:r>
+        <w:rPr>
+          <w:bCs/>
+          <w:b/>
+        </w:rPr>
+        <w:t xml:space="preserve">Banishment by ritual.</w:t>
+      </w:r>
+      <w:r>
+        <w:t xml:space="preserve"> </w:t>
+      </w:r>
+      <w:r>
+        <w:t xml:space="preserve">A properly completed banishment ritual preserves the host, if their body can survive without the demon holding it up.</w:t>
+      </w:r>
+    </w:p>
+    <w:p>
+      <w:pPr>
+        <w:numPr>
+          <w:ilvl w:val="0"/>
+          <w:numId w:val="1006"/>
+        </w:numPr>
+        <w:pStyle w:val="Compact"/>
+      </w:pPr>
+      <w:r>
+        <w:rPr>
+          <w:bCs/>
+          <w:b/>
+        </w:rPr>
+        <w:t xml:space="preserve">A possessed body.</w:t>
+      </w:r>
+      <w:r>
+        <w:t xml:space="preserve"> </w:t>
+      </w:r>
+      <w:r>
+        <w:t xml:space="preserve">A demon can keep a body moving through wounds that would otherwise be fatal, but possession heals nothing and grows nothing back. Ordinary injury to the body doesn’t kill the demon. This is not a vampire’s regeneration: when the demon goes, the body’s wounds are all still there.</w:t>
+      </w:r>
+    </w:p>
+    <w:p>
+      <w:pPr>
+        <w:numPr>
+          <w:ilvl w:val="0"/>
+          <w:numId w:val="1006"/>
+        </w:numPr>
+        <w:pStyle w:val="Compact"/>
+      </w:pPr>
+      <w:r>
+        <w:t xml:space="preserve">What counts as faith, how a possession is resolved at the table, and whether a possessed host’s wounds can be stabilized before the banishment are not yet set; until they are, the GM rules.</w:t>
+      </w:r>
+    </w:p>
+    <w:bookmarkEnd w:id="28"/>
+    <w:bookmarkStart w:id="29" w:name="rituals-and-remedies"/>
+    <w:p>
+      <w:pPr>
+        <w:pStyle w:val="Heading2"/>
+      </w:pPr>
+      <w:r>
+        <w:t xml:space="preserve">Rituals and remedies</w:t>
+      </w:r>
+    </w:p>
+    <w:p>
+      <w:pPr>
+        <w:pStyle w:val="FirstParagraph"/>
+      </w:pPr>
+      <w:r>
+        <w:t xml:space="preserve">A remedy or a ritual against the dark always has a procedure: what it requires, how long it takes, which rolls it calls for, its components, what happens if it’s interrupted, and what failure costs. Zombie treatment, lifting a curse, binding a ghost, banishing a demon and interfering with a hellhound’s pact all work this way. Use the</w:t>
+      </w:r>
+      <w:r>
+        <w:t xml:space="preserve"> </w:t>
+      </w:r>
+      <w:r>
+        <w:rPr>
+          <w:iCs/>
+          <w:i/>
+        </w:rPr>
+        <w:t xml:space="preserve">Magic</w:t>
+      </w:r>
+      <w:r>
+        <w:t xml:space="preserve"> </w:t>
+      </w:r>
+      <w:r>
+        <w:t xml:space="preserve">rules (a ritual clock in Occult rolls) and the weights above for any the GM hasn’t spelled out.</w:t>
+      </w:r>
+    </w:p>
+    <w:bookmarkEnd w:id="29"/>
+    <w:bookmarkEnd w:id="30"/>
+    <w:bookmarkStart w:id="33" w:name="lore-cards"/>
+    <w:p>
+      <w:pPr>
+        <w:pStyle w:val="Heading1"/>
+      </w:pPr>
+      <w:r>
         <w:t xml:space="preserve">Lore cards</w:t>
+      </w:r>
+    </w:p>
+    <w:p>
+      <w:pPr>
+        <w:pStyle w:val="FirstParagraph"/>
+      </w:pPr>
+      <w:r>
+        <w:t xml:space="preserve">Running investigations and recording what the characters learn. The rules players use are in the</w:t>
+      </w:r>
+      <w:r>
+        <w:t xml:space="preserve"> </w:t>
+      </w:r>
+      <w:r>
+        <w:rPr>
+          <w:iCs/>
+          <w:i/>
+        </w:rPr>
+        <w:t xml:space="preserve">Lore cards</w:t>
+      </w:r>
+      <w:r>
+        <w:t xml:space="preserve"> </w:t>
+      </w:r>
+      <w:r>
+        <w:t xml:space="preserve">chapter of the Players’ Guide; here are the subjects a card can cover (and a Hunter’s Almanac can start with), and the GM view’s tools for clocks and cards.</w:t>
+      </w:r>
+    </w:p>
+    <w:bookmarkStart w:id="31" w:name="lore-card-subjects"/>
+    <w:p>
+      <w:pPr>
+        <w:pStyle w:val="Heading2"/>
+      </w:pPr>
+      <w:r>
+        <w:t xml:space="preserve">Lore card subjects</w:t>
       </w:r>
     </w:p>
     <w:p>
@@ -3677,36 +4539,38 @@
         </w:tc>
       </w:tr>
     </w:tbl>
-    <w:bookmarkEnd w:id="23"/>
-    <w:bookmarkStart w:id="24" w:name="bites-and-curses"/>
+    <w:bookmarkEnd w:id="31"/>
+    <w:bookmarkStart w:id="32" w:name="the-discovery-panel"/>
     <w:p>
       <w:pPr>
         <w:pStyle w:val="Heading2"/>
       </w:pPr>
       <w:r>
-        <w:t xml:space="preserve">Bites and curses</w:t>
+        <w:t xml:space="preserve">The Discovery panel</w:t>
       </w:r>
     </w:p>
     <w:p>
       <w:pPr>
-        <w:numPr>
-          <w:ilvl w:val="0"/>
-          <w:numId w:val="1001"/>
-        </w:numPr>
-        <w:pStyle w:val="Compact"/>
-      </w:pPr>
+        <w:pStyle w:val="FirstParagraph"/>
+      </w:pPr>
+      <w:r>
+        <w:t xml:space="preserve">The GM view’s</w:t>
+      </w:r>
+      <w:r>
+        <w:t xml:space="preserve"> </w:t>
+      </w:r>
       <w:r>
         <w:rPr>
           <w:bCs/>
           <w:b/>
         </w:rPr>
-        <w:t xml:space="preserve">Zombie bite.</w:t>
-      </w:r>
-      <w:r>
-        <w:t xml:space="preserve"> </w:t>
-      </w:r>
-      <w:r>
-        <w:t xml:space="preserve">A bite that marks a box starts a 4-segment</w:t>
+        <w:t xml:space="preserve">Discovery</w:t>
+      </w:r>
+      <w:r>
+        <w:t xml:space="preserve"> </w:t>
+      </w:r>
+      <w:r>
+        <w:t xml:space="preserve">panel runs discovery clocks and the Harvest they race. Start a clock with its segments per phase (or a plain progress clock for a repair or a task in the same race), and fill it as the investigation rolls succeed. It stops at the Identify gate until you name the subject; then it shows every lore card the characters in the GM view already hold for it. The</w:t>
       </w:r>
       <w:r>
         <w:t xml:space="preserve"> </w:t>
@@ -3716,798 +4580,96 @@
           <w:bCs/>
           <w:b/>
         </w:rPr>
-        <w:t xml:space="preserve">Infection</w:t>
-      </w:r>
-      <w:r>
-        <w:t xml:space="preserve"> </w:t>
-      </w:r>
-      <w:r>
-        <w:t xml:space="preserve">clock, ticking each hour. A successful Medicine roll with an Occult remedy stops it; when it fills, you die, and rise.</w:t>
-      </w:r>
-    </w:p>
-    <w:p>
-      <w:pPr>
-        <w:numPr>
-          <w:ilvl w:val="0"/>
-          <w:numId w:val="1001"/>
-        </w:numPr>
-        <w:pStyle w:val="Compact"/>
-      </w:pPr>
+        <w:t xml:space="preserve">Failed roll</w:t>
+      </w:r>
+      <w:r>
+        <w:t xml:space="preserve"> </w:t>
+      </w:r>
+      <w:r>
+        <w:t xml:space="preserve">and</w:t>
+      </w:r>
+      <w:r>
+        <w:t xml:space="preserve"> </w:t>
+      </w:r>
       <w:r>
         <w:rPr>
           <w:bCs/>
           <w:b/>
         </w:rPr>
-        <w:t xml:space="preserve">Werewolf bite.</w:t>
-      </w:r>
-      <w:r>
-        <w:t xml:space="preserve"> </w:t>
-      </w:r>
-      <w:r>
-        <w:t xml:space="preserve">A bite under the full moon can pass on the curse; the GM decides, and lifting it is a major ritual.</w:t>
-      </w:r>
-    </w:p>
-    <w:p>
-      <w:pPr>
-        <w:numPr>
-          <w:ilvl w:val="0"/>
-          <w:numId w:val="1001"/>
-        </w:numPr>
-        <w:pStyle w:val="Compact"/>
-      </w:pPr>
+        <w:t xml:space="preserve">Push</w:t>
+      </w:r>
+      <w:r>
+        <w:t xml:space="preserve"> </w:t>
+      </w:r>
+      <w:r>
+        <w:t xml:space="preserve">buttons tick the track for how they were digging, and a failed roll ticks the Harvest too. When a clock fills,</w:t>
+      </w:r>
+      <w:r>
+        <w:t xml:space="preserve"> </w:t>
+      </w:r>
       <w:r>
         <w:rPr>
           <w:bCs/>
           <w:b/>
         </w:rPr>
-        <w:t xml:space="preserve">Vampire bite.</w:t>
-      </w:r>
-      <w:r>
-        <w:t xml:space="preserve"> </w:t>
-      </w:r>
-      <w:r>
-        <w:t xml:space="preserve">A vampire who drains a victim to Dying can choose to turn them. The turned belong to its lineage (see</w:t>
-      </w:r>
-      <w:r>
-        <w:t xml:space="preserve"> </w:t>
-      </w:r>
-      <w:r>
-        <w:rPr>
-          <w:iCs/>
-          <w:i/>
-        </w:rPr>
-        <w:t xml:space="preserve">Vampires</w:t>
-      </w:r>
-      <w:r>
-        <w:t xml:space="preserve">).</w:t>
-      </w:r>
-    </w:p>
-    <w:p>
-      <w:pPr>
-        <w:numPr>
-          <w:ilvl w:val="0"/>
-          <w:numId w:val="1001"/>
-        </w:numPr>
-        <w:pStyle w:val="Compact"/>
-      </w:pPr>
+        <w:t xml:space="preserve">Mint</w:t>
+      </w:r>
+      <w:r>
+        <w:t xml:space="preserve"> </w:t>
+      </w:r>
+      <w:r>
+        <w:t xml:space="preserve">gives the primary investigator the lore card and everyone you tick as present a shared copy.</w:t>
+      </w:r>
+      <w:r>
+        <w:t xml:space="preserve"> </w:t>
+      </w:r>
       <w:r>
         <w:rPr>
           <w:bCs/>
           <w:b/>
         </w:rPr>
-        <w:t xml:space="preserve">The wendigo’s hunger.</w:t>
-      </w:r>
-      <w:r>
-        <w:t xml:space="preserve"> </w:t>
-      </w:r>
-      <w:r>
-        <w:t xml:space="preserve">It begins with someone who ate human flesh to survive a starving winter in the high passes. A character who does starts a 4-segment</w:t>
+        <w:t xml:space="preserve">Record a finding without a clock</w:t>
+      </w:r>
+      <w:r>
+        <w:t xml:space="preserve"> </w:t>
+      </w:r>
+      <w:r>
+        <w:t xml:space="preserve">gives a lore card for something established directly (seen or tested, a reliable account, a creature’s word with evidence behind it) to whoever you tick. Save all to file afterwards, so the players’ character files carry it. The Discord bot’s</w:t>
       </w:r>
       <w:r>
         <w:t xml:space="preserve"> </w:t>
       </w:r>
       <w:r>
         <w:rPr>
-          <w:bCs/>
-          <w:b/>
+          <w:rStyle w:val="VerbatimChar"/>
         </w:rPr>
-        <w:t xml:space="preserve">Hunger</w:t>
-      </w:r>
-      <w:r>
-        <w:t xml:space="preserve"> </w:t>
-      </w:r>
-      <w:r>
-        <w:t xml:space="preserve">clock, ticking each week they go without it again; when it fills, they belong to the wendigo. Only a major ritual lifts it.</w:t>
+        <w:t xml:space="preserve">/discovery</w:t>
+      </w:r>
+      <w:r>
+        <w:t xml:space="preserve"> </w:t>
+      </w:r>
+      <w:r>
+        <w:t xml:space="preserve">and</w:t>
+      </w:r>
+      <w:r>
+        <w:t xml:space="preserve"> </w:t>
+      </w:r>
+      <w:r>
+        <w:rPr>
+          <w:rStyle w:val="VerbatimChar"/>
+        </w:rPr>
+        <w:t xml:space="preserve">/cards</w:t>
+      </w:r>
+      <w:r>
+        <w:t xml:space="preserve"> </w:t>
+      </w:r>
+      <w:r>
+        <w:t xml:space="preserve">commands do the same at a table that plays online.</w:t>
       </w:r>
     </w:p>
-    <w:p>
-      <w:pPr>
-        <w:numPr>
-          <w:ilvl w:val="0"/>
-          <w:numId w:val="1001"/>
-        </w:numPr>
-        <w:pStyle w:val="Compact"/>
-      </w:pPr>
-      <w:r>
-        <w:rPr>
-          <w:bCs/>
-          <w:b/>
-        </w:rPr>
-        <w:t xml:space="preserve">A wraith’s touch.</w:t>
-      </w:r>
-      <w:r>
-        <w:t xml:space="preserve"> </w:t>
-      </w:r>
-      <w:r>
-        <w:t xml:space="preserve">Someone killed by it rises as a wraith at the next new moon, unless they’re buried with salt in the coffin.</w:t>
-      </w:r>
-    </w:p>
-    <w:p>
-      <w:pPr>
-        <w:numPr>
-          <w:ilvl w:val="0"/>
-          <w:numId w:val="1001"/>
-        </w:numPr>
-        <w:pStyle w:val="Compact"/>
-      </w:pPr>
-      <w:r>
-        <w:rPr>
-          <w:bCs/>
-          <w:b/>
-        </w:rPr>
-        <w:t xml:space="preserve">A banshee’s keening.</w:t>
-      </w:r>
-      <w:r>
-        <w:t xml:space="preserve"> </w:t>
-      </w:r>
-      <w:r>
-        <w:t xml:space="preserve">She is tied to a family’s blood, not a place: once she has keened for one of a line, she can follow that family from town to town.</w:t>
-      </w:r>
-    </w:p>
-    <w:bookmarkEnd w:id="24"/>
-    <w:bookmarkStart w:id="25" w:name="vampires"/>
-    <w:p>
-      <w:pPr>
-        <w:pStyle w:val="Heading2"/>
-      </w:pPr>
-      <w:r>
-        <w:t xml:space="preserve">Vampires</w:t>
-      </w:r>
-    </w:p>
-    <w:p>
-      <w:pPr>
-        <w:numPr>
-          <w:ilvl w:val="0"/>
-          <w:numId w:val="1002"/>
-        </w:numPr>
-        <w:pStyle w:val="Compact"/>
-      </w:pPr>
-      <w:r>
-        <w:rPr>
-          <w:bCs/>
-          <w:b/>
-        </w:rPr>
-        <w:t xml:space="preserve">Lineages.</w:t>
-      </w:r>
-      <w:r>
-        <w:t xml:space="preserve"> </w:t>
-      </w:r>
-      <w:r>
-        <w:t xml:space="preserve">Each</w:t>
-      </w:r>
-      <w:r>
-        <w:t xml:space="preserve"> </w:t>
-      </w:r>
-      <w:r>
-        <w:rPr>
-          <w:bCs/>
-          <w:b/>
-        </w:rPr>
-        <w:t xml:space="preserve">natural vampire</w:t>
-      </w:r>
-      <w:r>
-        <w:t xml:space="preserve"> </w:t>
-      </w:r>
-      <w:r>
-        <w:t xml:space="preserve">sustains its own lineage: everyone it has turned, and everyone they have turned in turn. There is more than one natural vampire.</w:t>
-      </w:r>
-    </w:p>
-    <w:p>
-      <w:pPr>
-        <w:numPr>
-          <w:ilvl w:val="0"/>
-          <w:numId w:val="1002"/>
-        </w:numPr>
-        <w:pStyle w:val="Compact"/>
-      </w:pPr>
-      <w:r>
-        <w:rPr>
-          <w:bCs/>
-          <w:b/>
-        </w:rPr>
-        <w:t xml:space="preserve">Freeing a lineage.</w:t>
-      </w:r>
-      <w:r>
-        <w:t xml:space="preserve"> </w:t>
-      </w:r>
-      <w:r>
-        <w:t xml:space="preserve">Destroy the natural source, and the whole chain reverts to human, including those infected only indirectly. Destroying a vampire it turned (an intermediate) cures nobody.</w:t>
-      </w:r>
-    </w:p>
-    <w:p>
-      <w:pPr>
-        <w:numPr>
-          <w:ilvl w:val="0"/>
-          <w:numId w:val="1002"/>
-        </w:numPr>
-        <w:pStyle w:val="Compact"/>
-      </w:pPr>
-      <w:r>
-        <w:rPr>
-          <w:bCs/>
-          <w:b/>
-        </w:rPr>
-        <w:t xml:space="preserve">A stake isn’t the end.</w:t>
-      </w:r>
-      <w:r>
-        <w:t xml:space="preserve"> </w:t>
-      </w:r>
-      <w:r>
-        <w:t xml:space="preserve">A stake through the heart incapacitates a vampire; it doesn’t destroy it. Staking the source doesn’t free its lineage; destroying it does.</w:t>
-      </w:r>
-    </w:p>
-    <w:p>
-      <w:pPr>
-        <w:numPr>
-          <w:ilvl w:val="0"/>
-          <w:numId w:val="1002"/>
-        </w:numPr>
-        <w:pStyle w:val="Compact"/>
-      </w:pPr>
-      <w:r>
-        <w:rPr>
-          <w:bCs/>
-          <w:b/>
-        </w:rPr>
-        <w:t xml:space="preserve">What reversion does to the body.</w:t>
-      </w:r>
-      <w:r>
-        <w:t xml:space="preserve"> </w:t>
-      </w:r>
-      <w:r>
-        <w:t xml:space="preserve">Wounds that vampiric regeneration already healed stay healed. Wounds that hadn’t healed remain, and have their ordinary human consequences at once: someone reverting with three boxes marked is Dying. Reversion itself repairs nothing.</w:t>
-      </w:r>
-    </w:p>
-    <w:p>
-      <w:pPr>
-        <w:numPr>
-          <w:ilvl w:val="0"/>
-          <w:numId w:val="1002"/>
-        </w:numPr>
-        <w:pStyle w:val="Compact"/>
-      </w:pPr>
-      <w:r>
-        <w:t xml:space="preserve">This cure is a vampire’s alone: no other creature’s victims are freed by killing their maker.</w:t>
-      </w:r>
-    </w:p>
-    <w:bookmarkEnd w:id="25"/>
-    <w:bookmarkStart w:id="26" w:name="the-wendigo"/>
-    <w:p>
-      <w:pPr>
-        <w:pStyle w:val="Heading2"/>
-      </w:pPr>
-      <w:r>
-        <w:t xml:space="preserve">The wendigo</w:t>
-      </w:r>
-    </w:p>
-    <w:p>
-      <w:pPr>
-        <w:numPr>
-          <w:ilvl w:val="0"/>
-          <w:numId w:val="1003"/>
-        </w:numPr>
-        <w:pStyle w:val="Compact"/>
-      </w:pPr>
-      <w:r>
-        <w:t xml:space="preserve">Ordinary weapons wound it; only fire marks more than 1 box at a time.</w:t>
-      </w:r>
-    </w:p>
-    <w:p>
-      <w:pPr>
-        <w:numPr>
-          <w:ilvl w:val="0"/>
-          <w:numId w:val="1003"/>
-        </w:numPr>
-        <w:pStyle w:val="Compact"/>
-      </w:pPr>
-      <w:r>
-        <w:t xml:space="preserve">It heals unnaturally fast, and only fire interferes with that healing.</w:t>
-      </w:r>
-    </w:p>
-    <w:p>
-      <w:pPr>
-        <w:numPr>
-          <w:ilvl w:val="0"/>
-          <w:numId w:val="1003"/>
-        </w:numPr>
-        <w:pStyle w:val="Compact"/>
-      </w:pPr>
-      <w:r>
-        <w:t xml:space="preserve">It is destroyed for good only when it is</w:t>
-      </w:r>
-      <w:r>
-        <w:t xml:space="preserve"> </w:t>
-      </w:r>
-      <w:r>
-        <w:rPr>
-          <w:bCs/>
-          <w:b/>
-        </w:rPr>
-        <w:t xml:space="preserve">beheaded and its body burned</w:t>
-      </w:r>
-      <w:r>
-        <w:t xml:space="preserve">. After beheading, the body can still lash out, but blindly: its actions have no direction.</w:t>
-      </w:r>
-    </w:p>
-    <w:p>
-      <w:pPr>
-        <w:numPr>
-          <w:ilvl w:val="0"/>
-          <w:numId w:val="1003"/>
-        </w:numPr>
-        <w:pStyle w:val="Compact"/>
-      </w:pPr>
-      <w:r>
-        <w:t xml:space="preserve">How fast it heals, how long fire holds the healing back, and how the headless body’s blind attacks are run are not yet set; until they are, the GM rules.</w:t>
-      </w:r>
-    </w:p>
-    <w:bookmarkEnd w:id="26"/>
-    <w:bookmarkStart w:id="27" w:name="hellhounds"/>
-    <w:p>
-      <w:pPr>
-        <w:pStyle w:val="Heading2"/>
-      </w:pPr>
-      <w:r>
-        <w:t xml:space="preserve">Hellhounds</w:t>
-      </w:r>
-    </w:p>
-    <w:p>
-      <w:pPr>
-        <w:numPr>
-          <w:ilvl w:val="0"/>
-          <w:numId w:val="1004"/>
-        </w:numPr>
-        <w:pStyle w:val="Compact"/>
-      </w:pPr>
-      <w:r>
-        <w:t xml:space="preserve">A hellhound’s hunt is a</w:t>
-      </w:r>
-      <w:r>
-        <w:t xml:space="preserve"> </w:t>
-      </w:r>
-      <w:r>
-        <w:rPr>
-          <w:bCs/>
-          <w:b/>
-        </w:rPr>
-        <w:t xml:space="preserve">curse tied to a claim on someone’s soul</w:t>
-      </w:r>
-      <w:r>
-        <w:t xml:space="preserve">.</w:t>
-      </w:r>
-    </w:p>
-    <w:p>
-      <w:pPr>
-        <w:numPr>
-          <w:ilvl w:val="0"/>
-          <w:numId w:val="1004"/>
-        </w:numPr>
-        <w:pStyle w:val="Compact"/>
-      </w:pPr>
-      <w:r>
-        <w:t xml:space="preserve">The hunt ends only when the conditions behind the claim are</w:t>
-      </w:r>
-      <w:r>
-        <w:t xml:space="preserve"> </w:t>
-      </w:r>
-      <w:r>
-        <w:rPr>
-          <w:bCs/>
-          <w:b/>
-        </w:rPr>
-        <w:t xml:space="preserve">resolved or changed</w:t>
-      </w:r>
-      <w:r>
-        <w:t xml:space="preserve">. A powerful practitioner can interfere with the pact through a</w:t>
-      </w:r>
-      <w:r>
-        <w:t xml:space="preserve"> </w:t>
-      </w:r>
-      <w:r>
-        <w:rPr>
-          <w:bCs/>
-          <w:b/>
-        </w:rPr>
-        <w:t xml:space="preserve">major ritual</w:t>
-      </w:r>
-      <w:r>
-        <w:t xml:space="preserve">.</w:t>
-      </w:r>
-    </w:p>
-    <w:p>
-      <w:pPr>
-        <w:numPr>
-          <w:ilvl w:val="0"/>
-          <w:numId w:val="1004"/>
-        </w:numPr>
-        <w:pStyle w:val="Compact"/>
-      </w:pPr>
-      <w:r>
-        <w:rPr>
-          <w:bCs/>
-          <w:b/>
-        </w:rPr>
-        <w:t xml:space="preserve">Holy water</w:t>
-      </w:r>
-      <w:r>
-        <w:t xml:space="preserve"> </w:t>
-      </w:r>
-      <w:r>
-        <w:t xml:space="preserve">drives a hellhound off and protects its quarry for a time; it doesn’t cancel the pact.</w:t>
-      </w:r>
-    </w:p>
-    <w:p>
-      <w:pPr>
-        <w:numPr>
-          <w:ilvl w:val="0"/>
-          <w:numId w:val="1004"/>
-        </w:numPr>
-        <w:pStyle w:val="Compact"/>
-      </w:pPr>
-      <w:r>
-        <w:t xml:space="preserve">Whether destroying a hellhound’s physical body buys the quarry time, and how much, is not settled: the GM rules case by case.</w:t>
-      </w:r>
-    </w:p>
-    <w:bookmarkEnd w:id="27"/>
-    <w:bookmarkStart w:id="28" w:name="the-shadow-realm"/>
-    <w:p>
-      <w:pPr>
-        <w:pStyle w:val="Heading2"/>
-      </w:pPr>
-      <w:r>
-        <w:t xml:space="preserve">The shadow realm</w:t>
-      </w:r>
-    </w:p>
-    <w:p>
-      <w:pPr>
-        <w:pStyle w:val="FirstParagraph"/>
-      </w:pPr>
-      <w:r>
-        <w:t xml:space="preserve">The</w:t>
-      </w:r>
-      <w:r>
-        <w:t xml:space="preserve"> </w:t>
-      </w:r>
-      <w:r>
-        <w:rPr>
-          <w:bCs/>
-          <w:b/>
-        </w:rPr>
-        <w:t xml:space="preserve">shadow realm</w:t>
-      </w:r>
-      <w:r>
-        <w:t xml:space="preserve"> </w:t>
-      </w:r>
-      <w:r>
-        <w:t xml:space="preserve">is a real place in the same world as ours, not another Earth: it has no copies of our towns or our people. It is an independent and brutal ecology, with its own hunters and prey. Some of its creatures cross over, and some of those spread a</w:t>
-      </w:r>
-      <w:r>
-        <w:t xml:space="preserve"> </w:t>
-      </w:r>
-      <w:r>
-        <w:rPr>
-          <w:bCs/>
-          <w:b/>
-        </w:rPr>
-        <w:t xml:space="preserve">contagion</w:t>
-      </w:r>
-      <w:r>
-        <w:t xml:space="preserve"> </w:t>
-      </w:r>
-      <w:r>
-        <w:t xml:space="preserve">(a bite, a curse) that makes more of their kind; others never do. Each threat has its own weaknesses, found out on their own terms: not every horror is an infection.</w:t>
-      </w:r>
-    </w:p>
-    <w:p>
-      <w:pPr>
-        <w:pStyle w:val="BodyText"/>
-      </w:pPr>
-      <w:r>
-        <w:t xml:space="preserve">Some hold that the things of the dark are</w:t>
-      </w:r>
-      <w:r>
-        <w:t xml:space="preserve"> </w:t>
-      </w:r>
-      <w:r>
-        <w:rPr>
-          <w:bCs/>
-          <w:b/>
-        </w:rPr>
-        <w:t xml:space="preserve">fallen angels</w:t>
-      </w:r>
-      <w:r>
-        <w:t xml:space="preserve"> </w:t>
-      </w:r>
-      <w:r>
-        <w:t xml:space="preserve">and their brood. Others call that a preacher’s story. No one has settled it, and the game doesn’t.</w:t>
-      </w:r>
-    </w:p>
-    <w:bookmarkEnd w:id="28"/>
-    <w:bookmarkStart w:id="29" w:name="demons"/>
-    <w:p>
-      <w:pPr>
-        <w:pStyle w:val="Heading2"/>
-      </w:pPr>
-      <w:r>
-        <w:t xml:space="preserve">Demons</w:t>
-      </w:r>
-    </w:p>
-    <w:p>
-      <w:pPr>
-        <w:pStyle w:val="FirstParagraph"/>
-      </w:pPr>
-      <w:r>
-        <w:t xml:space="preserve">Three kinds of thing get called a demon, and they aren’t the same:</w:t>
-      </w:r>
-    </w:p>
-    <w:p>
-      <w:pPr>
-        <w:numPr>
-          <w:ilvl w:val="0"/>
-          <w:numId w:val="1005"/>
-        </w:numPr>
-        <w:pStyle w:val="Compact"/>
-      </w:pPr>
-      <w:r>
-        <w:rPr>
-          <w:bCs/>
-          <w:b/>
-        </w:rPr>
-        <w:t xml:space="preserve">Demonic creatures</w:t>
-      </w:r>
-      <w:r>
-        <w:t xml:space="preserve"> </w:t>
-      </w:r>
-      <w:r>
-        <w:t xml:space="preserve">native to the shadow realm: beasts and hunters of that ecology.</w:t>
-      </w:r>
-    </w:p>
-    <w:p>
-      <w:pPr>
-        <w:numPr>
-          <w:ilvl w:val="0"/>
-          <w:numId w:val="1005"/>
-        </w:numPr>
-        <w:pStyle w:val="Compact"/>
-      </w:pPr>
-      <w:r>
-        <w:rPr>
-          <w:bCs/>
-          <w:b/>
-        </w:rPr>
-        <w:t xml:space="preserve">Creatures under demonic influence</w:t>
-      </w:r>
-      <w:r>
-        <w:t xml:space="preserve">: something, or someone, bent by a demon’s power.</w:t>
-      </w:r>
-    </w:p>
-    <w:p>
-      <w:pPr>
-        <w:numPr>
-          <w:ilvl w:val="0"/>
-          <w:numId w:val="1005"/>
-        </w:numPr>
-        <w:pStyle w:val="Compact"/>
-      </w:pPr>
-      <w:r>
-        <w:rPr>
-          <w:bCs/>
-          <w:b/>
-        </w:rPr>
-        <w:t xml:space="preserve">True demons</w:t>
-      </w:r>
-      <w:r>
-        <w:t xml:space="preserve">, native to the deeper</w:t>
-      </w:r>
-      <w:r>
-        <w:t xml:space="preserve"> </w:t>
-      </w:r>
-      <w:r>
-        <w:rPr>
-          <w:bCs/>
-          <w:b/>
-        </w:rPr>
-        <w:t xml:space="preserve">Abyss</w:t>
-      </w:r>
-      <w:r>
-        <w:t xml:space="preserve">: a realm of no light and of eldritch powers, not a fiery hell. A true demon isn’t a creature of fire.</w:t>
-      </w:r>
-    </w:p>
-    <w:p>
-      <w:pPr>
-        <w:pStyle w:val="FirstParagraph"/>
-      </w:pPr>
-      <w:r>
-        <w:t xml:space="preserve">A</w:t>
-      </w:r>
-      <w:r>
-        <w:t xml:space="preserve"> </w:t>
-      </w:r>
-      <w:r>
-        <w:rPr>
-          <w:bCs/>
-          <w:b/>
-        </w:rPr>
-        <w:t xml:space="preserve">true demon can’t enter our world unaided</w:t>
-      </w:r>
-      <w:r>
-        <w:t xml:space="preserve">: it must be</w:t>
-      </w:r>
-      <w:r>
-        <w:t xml:space="preserve"> </w:t>
-      </w:r>
-      <w:r>
-        <w:rPr>
-          <w:bCs/>
-          <w:b/>
-        </w:rPr>
-        <w:t xml:space="preserve">summoned</w:t>
-      </w:r>
-      <w:r>
-        <w:t xml:space="preserve">, or come through a</w:t>
-      </w:r>
-      <w:r>
-        <w:t xml:space="preserve"> </w:t>
-      </w:r>
-      <w:r>
-        <w:rPr>
-          <w:bCs/>
-          <w:b/>
-        </w:rPr>
-        <w:t xml:space="preserve">possession</w:t>
-      </w:r>
-      <w:r>
-        <w:t xml:space="preserve">. A person can be possessed only if they are corrupted and have no faith of any kind at all. True demons are exceptionally powerful, and a generic fight is not how they are met: the encounter is a</w:t>
-      </w:r>
-      <w:r>
-        <w:t xml:space="preserve"> </w:t>
-      </w:r>
-      <w:r>
-        <w:rPr>
-          <w:bCs/>
-          <w:b/>
-        </w:rPr>
-        <w:t xml:space="preserve">ritual or a negotiation</w:t>
-      </w:r>
-      <w:r>
-        <w:t xml:space="preserve">, and the countermeasures are major rituals and powerful holy talismans.</w:t>
-      </w:r>
-    </w:p>
-    <w:p>
-      <w:pPr>
-        <w:numPr>
-          <w:ilvl w:val="0"/>
-          <w:numId w:val="1006"/>
-        </w:numPr>
-        <w:pStyle w:val="Compact"/>
-      </w:pPr>
-      <w:r>
-        <w:rPr>
-          <w:bCs/>
-          <w:b/>
-        </w:rPr>
-        <w:t xml:space="preserve">Banishment by a talisman.</w:t>
-      </w:r>
-      <w:r>
-        <w:t xml:space="preserve"> </w:t>
-      </w:r>
-      <w:r>
-        <w:t xml:space="preserve">A sufficiently powerful holy talisman can banish a demon by breaking its binding to our world. What happens to the host depends on the talisman and how it acts: a holy sword that fatally wounds the host banishes the demon and kills the host.</w:t>
-      </w:r>
-    </w:p>
-    <w:p>
-      <w:pPr>
-        <w:numPr>
-          <w:ilvl w:val="0"/>
-          <w:numId w:val="1006"/>
-        </w:numPr>
-        <w:pStyle w:val="Compact"/>
-      </w:pPr>
-      <w:r>
-        <w:rPr>
-          <w:bCs/>
-          <w:b/>
-        </w:rPr>
-        <w:t xml:space="preserve">Banishment by ritual.</w:t>
-      </w:r>
-      <w:r>
-        <w:t xml:space="preserve"> </w:t>
-      </w:r>
-      <w:r>
-        <w:t xml:space="preserve">A properly completed banishment ritual preserves the host, if their body can survive without the demon holding it up.</w:t>
-      </w:r>
-    </w:p>
-    <w:p>
-      <w:pPr>
-        <w:numPr>
-          <w:ilvl w:val="0"/>
-          <w:numId w:val="1006"/>
-        </w:numPr>
-        <w:pStyle w:val="Compact"/>
-      </w:pPr>
-      <w:r>
-        <w:rPr>
-          <w:bCs/>
-          <w:b/>
-        </w:rPr>
-        <w:t xml:space="preserve">A possessed body.</w:t>
-      </w:r>
-      <w:r>
-        <w:t xml:space="preserve"> </w:t>
-      </w:r>
-      <w:r>
-        <w:t xml:space="preserve">A demon can keep a body moving through wounds that would otherwise be fatal, but possession heals nothing and grows nothing back. Ordinary injury to the body doesn’t kill the demon. This is not a vampire’s regeneration: when the demon goes, the body’s wounds are all still there.</w:t>
-      </w:r>
-    </w:p>
-    <w:p>
-      <w:pPr>
-        <w:numPr>
-          <w:ilvl w:val="0"/>
-          <w:numId w:val="1006"/>
-        </w:numPr>
-        <w:pStyle w:val="Compact"/>
-      </w:pPr>
-      <w:r>
-        <w:t xml:space="preserve">What counts as faith, how a possession is resolved at the table, and whether a possessed host’s wounds can be stabilized before the banishment are not yet set; until they are, the GM rules.</w:t>
-      </w:r>
-    </w:p>
-    <w:bookmarkEnd w:id="29"/>
-    <w:bookmarkStart w:id="30" w:name="rituals-and-remedies"/>
-    <w:p>
-      <w:pPr>
-        <w:pStyle w:val="Heading2"/>
-      </w:pPr>
-      <w:r>
-        <w:t xml:space="preserve">Rituals and remedies</w:t>
-      </w:r>
-    </w:p>
-    <w:p>
-      <w:pPr>
-        <w:pStyle w:val="FirstParagraph"/>
-      </w:pPr>
-      <w:r>
-        <w:t xml:space="preserve">A remedy or a ritual against the dark always has a procedure: what it requires, how long it takes, which rolls it calls for, its components, what happens if it’s interrupted, and what failure costs. Zombie treatment, lifting a curse, binding a ghost, banishing a demon and interfering with a hellhound’s pact all work this way. Use the</w:t>
-      </w:r>
-      <w:r>
-        <w:t xml:space="preserve"> </w:t>
-      </w:r>
-      <w:r>
-        <w:rPr>
-          <w:iCs/>
-          <w:i/>
-        </w:rPr>
-        <w:t xml:space="preserve">Magic</w:t>
-      </w:r>
-      <w:r>
-        <w:t xml:space="preserve"> </w:t>
-      </w:r>
-      <w:r>
-        <w:t xml:space="preserve">rules (a ritual clock in Occult rolls) and the weights above for any the GM hasn’t spelled out.</w:t>
-      </w:r>
-    </w:p>
-    <w:bookmarkEnd w:id="30"/>
-    <w:bookmarkEnd w:id="31"/>
-    <w:bookmarkStart w:id="32" w:name="threats"/>
+    <w:bookmarkEnd w:id="32"/>
+    <w:bookmarkEnd w:id="33"/>
+    <w:bookmarkStart w:id="34" w:name="threats"/>
     <w:p>
       <w:pPr>
         <w:pStyle w:val="Heading1"/>
@@ -6313,8 +6475,8 @@
         <w:t xml:space="preserve">For a tougher version, add +1 to its targets and one box; for a weaker one, subtract.</w:t>
       </w:r>
     </w:p>
-    <w:bookmarkEnd w:id="32"/>
-    <w:bookmarkStart w:id="36" w:name="the-gms-tools"/>
+    <w:bookmarkEnd w:id="34"/>
+    <w:bookmarkStart w:id="37" w:name="the-gms-tools"/>
     <w:p>
       <w:pPr>
         <w:pStyle w:val="Heading1"/>
@@ -6323,7 +6485,7 @@
         <w:t xml:space="preserve">The GM’s tools</w:t>
       </w:r>
     </w:p>
-    <w:bookmarkStart w:id="33" w:name="the-battle-map"/>
+    <w:bookmarkStart w:id="35" w:name="the-battle-map"/>
     <w:p>
       <w:pPr>
         <w:pStyle w:val="Heading2"/>
@@ -6575,8 +6737,8 @@
         <w:t xml:space="preserve">in the Players’ Guide.</w:t>
       </w:r>
     </w:p>
-    <w:bookmarkEnd w:id="33"/>
-    <w:bookmarkStart w:id="34" w:name="the-encounter-panel"/>
+    <w:bookmarkEnd w:id="35"/>
+    <w:bookmarkStart w:id="36" w:name="the-encounter-panel"/>
     <w:p>
       <w:pPr>
         <w:pStyle w:val="Heading2"/>
@@ -6643,136 +6805,8 @@
         <w:t xml:space="preserve">The GM can start a shared table from the GM view and give the players its code; each player joins from their character’s Ride tab. While they’re connected, every roll from a sheet is rolled by the table server, so the whole table sees the same dice as they land, in a live log on the Ride tab and on the GM view, along with who rolled, against what, and any telling hit. A point reroll answers its own roll, once. Each player’s character is shared with the GM too: it appears among the GM view’s characters, marked at the table, and its injuries, points, ammunition and form stay in step both ways, whether they’re changed on the sheet, on the GM’s card or in an encounter. In a fight, each player’s Ride tab shows the GM’s battle map and the encounter’s turn order and latest results; a player drags their own token, and on their turn sends the GM what they’ll do, which the GM puts into the Encounter panel and runs. The GM can remove a player from the table, and give the table a new code: everyone at it moves with it, and the old code stops working. Without a table, the roller works exactly as it always has.</w:t>
       </w:r>
     </w:p>
-    <w:bookmarkEnd w:id="34"/>
-    <w:bookmarkStart w:id="35" w:name="the-discovery-panel"/>
-    <w:p>
-      <w:pPr>
-        <w:pStyle w:val="Heading2"/>
-      </w:pPr>
-      <w:r>
-        <w:t xml:space="preserve">The Discovery panel</w:t>
-      </w:r>
-    </w:p>
-    <w:p>
-      <w:pPr>
-        <w:pStyle w:val="FirstParagraph"/>
-      </w:pPr>
-      <w:r>
-        <w:t xml:space="preserve">The GM view’s</w:t>
-      </w:r>
-      <w:r>
-        <w:t xml:space="preserve"> </w:t>
-      </w:r>
-      <w:r>
-        <w:rPr>
-          <w:bCs/>
-          <w:b/>
-        </w:rPr>
-        <w:t xml:space="preserve">Discovery</w:t>
-      </w:r>
-      <w:r>
-        <w:t xml:space="preserve"> </w:t>
-      </w:r>
-      <w:r>
-        <w:t xml:space="preserve">panel runs discovery clocks and the Harvest they race. Start a clock with its segments per phase (or a plain progress clock for a repair or a task in the same race), and fill it as the investigation rolls succeed. It stops at the Identify gate until you name the subject; then it shows every lore card the characters in the GM view already hold for it. The</w:t>
-      </w:r>
-      <w:r>
-        <w:t xml:space="preserve"> </w:t>
-      </w:r>
-      <w:r>
-        <w:rPr>
-          <w:bCs/>
-          <w:b/>
-        </w:rPr>
-        <w:t xml:space="preserve">Failed roll</w:t>
-      </w:r>
-      <w:r>
-        <w:t xml:space="preserve"> </w:t>
-      </w:r>
-      <w:r>
-        <w:t xml:space="preserve">and</w:t>
-      </w:r>
-      <w:r>
-        <w:t xml:space="preserve"> </w:t>
-      </w:r>
-      <w:r>
-        <w:rPr>
-          <w:bCs/>
-          <w:b/>
-        </w:rPr>
-        <w:t xml:space="preserve">Push</w:t>
-      </w:r>
-      <w:r>
-        <w:t xml:space="preserve"> </w:t>
-      </w:r>
-      <w:r>
-        <w:t xml:space="preserve">buttons tick the track for how they were digging, and a failed roll ticks the Harvest too. When a clock fills,</w:t>
-      </w:r>
-      <w:r>
-        <w:t xml:space="preserve"> </w:t>
-      </w:r>
-      <w:r>
-        <w:rPr>
-          <w:bCs/>
-          <w:b/>
-        </w:rPr>
-        <w:t xml:space="preserve">Mint</w:t>
-      </w:r>
-      <w:r>
-        <w:t xml:space="preserve"> </w:t>
-      </w:r>
-      <w:r>
-        <w:t xml:space="preserve">gives the primary investigator the lore card and everyone you tick as present a shared copy.</w:t>
-      </w:r>
-      <w:r>
-        <w:t xml:space="preserve"> </w:t>
-      </w:r>
-      <w:r>
-        <w:rPr>
-          <w:bCs/>
-          <w:b/>
-        </w:rPr>
-        <w:t xml:space="preserve">Record a finding without a clock</w:t>
-      </w:r>
-      <w:r>
-        <w:t xml:space="preserve"> </w:t>
-      </w:r>
-      <w:r>
-        <w:t xml:space="preserve">gives a lore card for something established directly (seen or tested, a reliable account, a creature’s word with evidence behind it) to whoever you tick. Save all to file afterwards, so the players’ character files carry it. The Discord bot’s</w:t>
-      </w:r>
-      <w:r>
-        <w:t xml:space="preserve"> </w:t>
-      </w:r>
-      <w:r>
-        <w:rPr>
-          <w:rStyle w:val="VerbatimChar"/>
-        </w:rPr>
-        <w:t xml:space="preserve">/discovery</w:t>
-      </w:r>
-      <w:r>
-        <w:t xml:space="preserve"> </w:t>
-      </w:r>
-      <w:r>
-        <w:t xml:space="preserve">and</w:t>
-      </w:r>
-      <w:r>
-        <w:t xml:space="preserve"> </w:t>
-      </w:r>
-      <w:r>
-        <w:rPr>
-          <w:rStyle w:val="VerbatimChar"/>
-        </w:rPr>
-        <w:t xml:space="preserve">/cards</w:t>
-      </w:r>
-      <w:r>
-        <w:t xml:space="preserve"> </w:t>
-      </w:r>
-      <w:r>
-        <w:t xml:space="preserve">commands do the same at a table that plays online.</w:t>
-      </w:r>
-    </w:p>
-    <w:bookmarkEnd w:id="35"/>
     <w:bookmarkEnd w:id="36"/>
+    <w:bookmarkEnd w:id="37"/>
     <w:sectPr/>
   </w:body>
 </w:document>

</xml_diff>

<commit_message>
Website: creators link back to the site
Each creator on the website gets a slim link bar above its header: back to the
Legend Dynamics home page, and to its setting's page. The creator itself carries
only a marker (tools/build-site.py fills it in), so the published creators and
local copies are unchanged. Hidden in print.

Co-Authored-By: Claude Opus 5.5 <noreply@anthropic.com>
Claude-Session: https://claude.ai/code/session_015SADCFzhKijkC2foUmXrpC
</commit_message>
<xml_diff>
--- a/legend-dynamics/site/trails-of-blood-and-dust/Trails_of_Blood_Dust_GM_Guide.docx
+++ b/legend-dynamics/site/trails-of-blood-and-dust/Trails_of_Blood_Dust_GM_Guide.docx
@@ -2471,7 +2471,33 @@
         <w:t xml:space="preserve"> </w:t>
       </w:r>
       <w:r>
-        <w:t xml:space="preserve">silver marks its extra box fired by someone who has never heard of werewolves, and a hunter who suspects silver can load it on purpose. Called shots (at a heart, a head) follow the ordinary combat rules. What a weakness doesn’t give anyone is an unfamiliar ritual: a banishment, a binding or a cure still needs its procedure, the knowledge, the skill and the components.</w:t>
+        <w:t xml:space="preserve">silver marks its extra box fired by someone who has never heard of werewolves, and a hunter who suspects silver can load it on purpose. Called shots (at a heart, a head) follow the ordinary combat rules. With a lore card for the creature and the load its weakness calls for, a hunter can make a</w:t>
+      </w:r>
+      <w:r>
+        <w:t xml:space="preserve"> </w:t>
+      </w:r>
+      <w:r>
+        <w:rPr>
+          <w:bCs/>
+          <w:b/>
+        </w:rPr>
+        <w:t xml:space="preserve">hunter’s shot</w:t>
+      </w:r>
+      <w:r>
+        <w:t xml:space="preserve">: the called shot or effect the card permits, which would otherwise be impossible (see</w:t>
+      </w:r>
+      <w:r>
+        <w:t xml:space="preserve"> </w:t>
+      </w:r>
+      <w:r>
+        <w:rPr>
+          <w:iCs/>
+          <w:i/>
+        </w:rPr>
+        <w:t xml:space="preserve">Special loads</w:t>
+      </w:r>
+      <w:r>
+        <w:t xml:space="preserve">). What a weakness doesn’t give anyone is an unfamiliar ritual: a banishment, a binding or a cure still needs its procedure, the knowledge, the skill and the components.</w:t>
       </w:r>
     </w:p>
     <w:tbl>
@@ -7164,7 +7190,7 @@
         <w:t xml:space="preserve"> </w:t>
       </w:r>
       <w:r>
-        <w:t xml:space="preserve">rules and shows every roll. Add characters from the GM view and opponents from the Threats table (or make one up on the spot), then start: it keeps the turn order by Agility, and for each attack works out the range, the defense (Dodge, Parry or Block, one a round, and a second at −2 with Additional Defense), the boxes marked and any telling hit, offering a Grit point choices at the moment they apply. Hits land on the character cards and the battle map, and with gritty combat on, grievous wounds are rolled and kept. The panel keeps a log and a summary of the fight, which can be saved to a file. It’s a helper, not a rule: the GM can rule any result differently, and the log says so. For each attack, choose what it’s made of (silver, cold iron, a wooden stake or fire), and the panel applies the rules that turn on it: a shapechanger’s Tough in their form (and what gets past it), a weakness that marks one box more, and a creature only the right weapon can hurt.</w:t>
+        <w:t xml:space="preserve">rules and shows every roll. Add characters from the GM view and opponents from the Threats table (or make one up on the spot), then start: it keeps the turn order by Agility, and for each attack works out the range, the defense (Dodge, Parry or Block, one a round, and a second at −2 with Additional Defense), the boxes marked and any telling hit, offering a Grit point choices at the moment they apply. Hits land on the character cards and the battle map, and with gritty combat on, grievous wounds are rolled and kept. The panel keeps a log and a summary of the fight, which can be saved to a file. It’s a helper, not a rule: the GM can rule any result differently, and the log says so. For each attack, choose what it’s made of (silver, cold iron, a wooden stake, fire, rock salt or blessed), and the panel applies the rules that turn on it: a shapechanger’s Tough in their form (and what gets past it), a weakness that marks one box more, and a creature only the right weapon can hurt.</w:t>
       </w:r>
     </w:p>
     <w:p>

</xml_diff>

<commit_message>
Trails: the first job is a monster hunt, for hunters of any role
Dead Man's Wages leads with the hunt: a hook for every kind of hunter
(lawman, doctor, preacher, gambler or practitioner, bounty hunter, the
cursed and the dead), the clues and who finds them best, the ghouls and
their weakness, and the burial cave. The showdown and Heat stay in as
one scene, not the spine. The website's pitch and "what makes it
different" lead with the monsters and the hunters.

Co-Authored-By: Claude Opus 5.5 <noreply@anthropic.com>
Claude-Session: https://claude.ai/code/session_015SADCFzhKijkC2foUmXrpC
</commit_message>
<xml_diff>
--- a/legend-dynamics/site/trails-of-blood-and-dust/Trails_of_Blood_Dust_GM_Guide.docx
+++ b/legend-dynamics/site/trails-of-blood-and-dust/Trails_of_Blood_Dust_GM_Guide.docx
@@ -163,7 +163,7 @@
         <w:pStyle w:val="FirstParagraph"/>
       </w:pPr>
       <w:r>
-        <w:t xml:space="preserve">A ready-to-run job to start a campaign with: everything it needs is here, and the pregenerated characters in the creator are written into it.</w:t>
+        <w:t xml:space="preserve">A ready-to-run monster hunt to start a campaign with. Everything it needs is here, the hook reaches hunters of any role, and the pregenerated characters in the creator are written into it.</w:t>
       </w:r>
     </w:p>
     <w:bookmarkStart w:id="20" w:name="the-first-job-dead-mans-wages"/>
@@ -180,7 +180,7 @@
         <w:pStyle w:val="FirstParagraph"/>
       </w:pPr>
       <w:r>
-        <w:t xml:space="preserve">A starter job for three to six hunters, for one or two sessions. It shows off what makes the setting different: a ride on the trail, a showdown in the street, Heat and a wanted poster, an investigation that ends in a lore card, and a monster that isn’t the one you came for. It’s written for the six pregenerated characters, and works with any.</w:t>
+        <w:t xml:space="preserve">A starter job for three to six hunters, for one or two sessions. It’s a monster hunt: strange deaths, a town that won’t talk, an investigation that names the thing, and a descent into the dark to finish it. Along the way it shows off the trail, a showdown and the discovery clocks. It’s written for the six pregenerated characters, and works for hunters of any role: the hook reaches each of them for a different reason.</w:t>
       </w:r>
     </w:p>
     <w:p>
@@ -198,7 +198,7 @@
         <w:t xml:space="preserve"> </w:t>
       </w:r>
       <w:r>
-        <w:t xml:space="preserve">Each hunter gets a letter and a $50 bank draft.</w:t>
+        <w:t xml:space="preserve">Each hunter gets a letter, a $50 bank draft and a reason to come.</w:t>
       </w:r>
       <w:r>
         <w:t xml:space="preserve"> </w:t>
@@ -208,129 +208,13 @@
           <w:iCs/>
           <w:i/>
         </w:rPr>
-        <w:t xml:space="preserve">Come to Mercy Springs. Something is killing my men in the Lazarus mine, and the company says it’s cave-ins. Ask for me at the Silver Dollar. Ezra Quill, foreman.</w:t>
-      </w:r>
-      <w:r>
-        <w:t xml:space="preserve"> </w:t>
-      </w:r>
-      <w:r>
-        <w:t xml:space="preserve">Lucinda Marsh’s cards turn up the Hanged Man the night it arrives. Ruth Calloway knows the name: Quill wrote to the Marshal’s office a month ago, and nobody answered.</w:t>
-      </w:r>
-    </w:p>
-    <w:p>
-      <w:pPr>
-        <w:pStyle w:val="BodyText"/>
-      </w:pPr>
-      <w:r>
-        <w:rPr>
-          <w:bCs/>
-          <w:b/>
-        </w:rPr>
-        <w:t xml:space="preserve">What’s really happening.</w:t>
-      </w:r>
-      <w:r>
-        <w:t xml:space="preserve"> </w:t>
-      </w:r>
-      <w:r>
-        <w:t xml:space="preserve">The Lazarus mine broke into a burial cave older than the territory, and ghouls came up out of it. They take a miner a night and drag the bodies down. The company’s owner, Augustus Crane, wants the silver more than the men, and told his foreman to keep quiet. Ezra Quill wouldn’t, so Crane had him shot and buried two weeks ago. Quill rose at the next midnight: he’s a revenant, and he wrote the letters. He wants Crane dead, and he’ll help the hunters with the ghouls if they help him with that.</w:t>
-      </w:r>
-    </w:p>
-    <w:p>
-      <w:pPr>
-        <w:pStyle w:val="BodyText"/>
-      </w:pPr>
-      <w:r>
-        <w:rPr>
-          <w:bCs/>
-          <w:b/>
-        </w:rPr>
-        <w:t xml:space="preserve">1. The ride in.</w:t>
-      </w:r>
-      <w:r>
-        <w:t xml:space="preserve"> </w:t>
-      </w:r>
-      <w:r>
-        <w:t xml:space="preserve">Mercy Springs is a few days’ ride: a trail clock of 4. Run it by</w:t>
-      </w:r>
-      <w:r>
-        <w:t xml:space="preserve"> </w:t>
-      </w:r>
-      <w:r>
-        <w:rPr>
-          <w:iCs/>
-          <w:i/>
-        </w:rPr>
-        <w:t xml:space="preserve">The trail</w:t>
-      </w:r>
-      <w:r>
-        <w:t xml:space="preserve"> </w:t>
-      </w:r>
-      <w:r>
-        <w:t xml:space="preserve">rules in the Players’ Guide. Whatever the hazards are, on the last day the guide finds drag marks leading off the trail toward the hills, and a boot with a foot still in it.</w:t>
-      </w:r>
-    </w:p>
-    <w:p>
-      <w:pPr>
-        <w:pStyle w:val="BodyText"/>
-      </w:pPr>
-      <w:r>
-        <w:rPr>
-          <w:bCs/>
-          <w:b/>
-        </w:rPr>
-        <w:t xml:space="preserve">2. Mercy Springs.</w:t>
-      </w:r>
-      <w:r>
-        <w:t xml:space="preserve"> </w:t>
-      </w:r>
-      <w:r>
-        <w:t xml:space="preserve">A silver boomtown gone quiet. Miners drink in silence at the Silver Dollar. Sheriff Hiram Vance meets the hunters before they’ve watered their horses. He’s in Crane’s pocket and tells them there’s no work here. Ezra Quill? The sheriff buried him himself: a cave-in. The letter’s postmark is from last Tuesday.</w:t>
-      </w:r>
-    </w:p>
-    <w:p>
-      <w:pPr>
-        <w:pStyle w:val="BodyText"/>
-      </w:pPr>
-      <w:r>
-        <w:rPr>
-          <w:bCs/>
-          <w:b/>
-        </w:rPr>
-        <w:t xml:space="preserve">3. The showdown.</w:t>
-      </w:r>
-      <w:r>
-        <w:t xml:space="preserve"> </w:t>
-      </w:r>
-      <w:r>
-        <w:t xml:space="preserve">Crane’s gunman, Cyrus Pruitt (an Outlaw, Will 11), calls out whichever hunter asks the most questions, at noon on Main Street. Run it as a showdown. If he dies with half the town watching, Sheriff Vance calls it murder: Heat marks a box. If Heat reaches two, put a poster out on the shooter. That gives the next job its bounty hunter.</w:t>
-      </w:r>
-    </w:p>
-    <w:p>
-      <w:pPr>
-        <w:pStyle w:val="BodyText"/>
-      </w:pPr>
-      <w:r>
-        <w:rPr>
-          <w:bCs/>
-          <w:b/>
-        </w:rPr>
-        <w:t xml:space="preserve">4. The digging.</w:t>
-      </w:r>
-      <w:r>
-        <w:t xml:space="preserve"> </w:t>
-      </w:r>
-      <w:r>
-        <w:t xml:space="preserve">The investigation runs on a discovery clock with the Harvest clock ticking (</w:t>
-      </w:r>
-      <w:r>
-        <w:rPr>
-          <w:iCs/>
-          <w:i/>
-        </w:rPr>
-        <w:t xml:space="preserve">Lore cards</w:t>
-      </w:r>
-      <w:r>
-        <w:t xml:space="preserve">, in the Players’ Guide); another miner goes missing each time it fills. The clues:</w:t>
+        <w:t xml:space="preserve">Come to Mercy Springs. Something is killing my men in the Lazarus mine, and the company calls it cave-ins. Ask for me at the Silver Dollar. Ezra Quill, foreman.</w:t>
+      </w:r>
+      <w:r>
+        <w:t xml:space="preserve"> </w:t>
+      </w:r>
+      <w:r>
+        <w:t xml:space="preserve">Give each role its own way in:</w:t>
       </w:r>
     </w:p>
     <w:p>
@@ -342,7 +226,17 @@
         <w:pStyle w:val="Compact"/>
       </w:pPr>
       <w:r>
-        <w:t xml:space="preserve">Dr. Webb’s examination finds the dead miners’ wounds were made by teeth, after death. The bodies were dragged, not carried.</w:t>
+        <w:rPr>
+          <w:bCs/>
+          <w:b/>
+        </w:rPr>
+        <w:t xml:space="preserve">A lawman</w:t>
+      </w:r>
+      <w:r>
+        <w:t xml:space="preserve"> </w:t>
+      </w:r>
+      <w:r>
+        <w:t xml:space="preserve">has a stack of missing-person reports from Mercy Springs that nobody answered. Ruth Calloway knows Quill wrote to the Marshal’s office a month ago.</w:t>
       </w:r>
     </w:p>
     <w:p>
@@ -354,7 +248,17 @@
         <w:pStyle w:val="Compact"/>
       </w:pPr>
       <w:r>
-        <w:t xml:space="preserve">Quill’s grave is empty, dug out from below, and the coffin lid has scratches on the inside.</w:t>
+        <w:rPr>
+          <w:bCs/>
+          <w:b/>
+        </w:rPr>
+        <w:t xml:space="preserve">A doctor</w:t>
+      </w:r>
+      <w:r>
+        <w:t xml:space="preserve"> </w:t>
+      </w:r>
+      <w:r>
+        <w:t xml:space="preserve">is asked to look at bodies the company doctor won’t sign for.</w:t>
       </w:r>
     </w:p>
     <w:p>
@@ -366,7 +270,17 @@
         <w:pStyle w:val="Compact"/>
       </w:pPr>
       <w:r>
-        <w:t xml:space="preserve">The miners’ widows say their men came home with sand in their boots. There’s no sand in a silver mine.</w:t>
+        <w:rPr>
+          <w:bCs/>
+          <w:b/>
+        </w:rPr>
+        <w:t xml:space="preserve">A preacher</w:t>
+      </w:r>
+      <w:r>
+        <w:t xml:space="preserve"> </w:t>
+      </w:r>
+      <w:r>
+        <w:t xml:space="preserve">is asked to bury them, because the town’s own preacher has fled.</w:t>
       </w:r>
     </w:p>
     <w:p>
@@ -378,20 +292,17 @@
         <w:pStyle w:val="Compact"/>
       </w:pPr>
       <w:r>
-        <w:t xml:space="preserve">Rev. Stone finds the church locked and the preacher gone. In his desk: a map of the Lazarus mine’s lowest drift, marked</w:t>
-      </w:r>
-      <w:r>
-        <w:t xml:space="preserve"> </w:t>
-      </w:r>
-      <w:r>
-        <w:rPr>
-          <w:iCs/>
-          <w:i/>
-        </w:rPr>
-        <w:t xml:space="preserve">the old graves</w:t>
-      </w:r>
-      <w:r>
-        <w:t xml:space="preserve">.</w:t>
+        <w:rPr>
+          <w:bCs/>
+          <w:b/>
+        </w:rPr>
+        <w:t xml:space="preserve">A gambler or a practitioner</w:t>
+      </w:r>
+      <w:r>
+        <w:t xml:space="preserve"> </w:t>
+      </w:r>
+      <w:r>
+        <w:t xml:space="preserve">hears the silver’s still coming up, and that the cards turn up the Hanged Man for anyone who asks about the place. Lucinda Marsh’s do, the night the letter comes.</w:t>
       </w:r>
     </w:p>
     <w:p>
@@ -403,7 +314,39 @@
         <w:pStyle w:val="Compact"/>
       </w:pPr>
       <w:r>
-        <w:t xml:space="preserve">A night watch on the boarding house: a ghoul at the window, and a man in a burial suit shooting at it from the street.</w:t>
+        <w:rPr>
+          <w:bCs/>
+          <w:b/>
+        </w:rPr>
+        <w:t xml:space="preserve">A bounty hunter</w:t>
+      </w:r>
+      <w:r>
+        <w:t xml:space="preserve"> </w:t>
+      </w:r>
+      <w:r>
+        <w:t xml:space="preserve">is offered the price on whatever is doing the killing.</w:t>
+      </w:r>
+    </w:p>
+    <w:p>
+      <w:pPr>
+        <w:numPr>
+          <w:ilvl w:val="0"/>
+          <w:numId w:val="1001"/>
+        </w:numPr>
+        <w:pStyle w:val="Compact"/>
+      </w:pPr>
+      <w:r>
+        <w:rPr>
+          <w:bCs/>
+          <w:b/>
+        </w:rPr>
+        <w:t xml:space="preserve">A cursed or a dead hunter</w:t>
+      </w:r>
+      <w:r>
+        <w:t xml:space="preserve"> </w:t>
+      </w:r>
+      <w:r>
+        <w:t xml:space="preserve">gets the letter in a hand they somehow know: the dead write to the dead. Isaiah Booker and Tom Feeney both feel it.</w:t>
       </w:r>
     </w:p>
     <w:p>
@@ -411,7 +354,17 @@
         <w:pStyle w:val="FirstParagraph"/>
       </w:pPr>
       <w:r>
-        <w:t xml:space="preserve">When the Identify phase is done, the hunters know what the creatures are: ghouls (flee daylight and fire). Filling the clock earns a lore card for what they’ve established.</w:t>
+        <w:rPr>
+          <w:bCs/>
+          <w:b/>
+        </w:rPr>
+        <w:t xml:space="preserve">What’s really happening.</w:t>
+      </w:r>
+      <w:r>
+        <w:t xml:space="preserve"> </w:t>
+      </w:r>
+      <w:r>
+        <w:t xml:space="preserve">The Lazarus mine broke into a burial cave older than the territory, and ghouls came up out of it. They take a miner a night and drag the bodies down to feed. Augustus Crane, who owns the mine, wants the silver more than the men; his foreman Ezra Quill wouldn’t keep quiet, so Crane had him shot and buried two weeks ago. Quill rose at the next midnight. He’s a revenant, and he wrote the letters. He’ll help the hunters against the ghouls, because they’re eating his men, but what he really wants is Crane.</w:t>
       </w:r>
     </w:p>
     <w:p>
@@ -423,13 +376,42 @@
           <w:bCs/>
           <w:b/>
         </w:rPr>
-        <w:t xml:space="preserve">5. Ezra Quill.</w:t>
-      </w:r>
-      <w:r>
-        <w:t xml:space="preserve"> </w:t>
-      </w:r>
-      <w:r>
-        <w:t xml:space="preserve">The man in the burial suit finds the hunters, at midnight, when he rises. He wants Crane, and he offers what he knows of the mine in exchange. Isaiah Booker knows what it is to be put in the ground before your time, and Quill knows it about him at a glance. Quill is a Revenant gunslinger. He rises at the next midnight unless his grave is salted and burned, and he knows it.</w:t>
+        <w:t xml:space="preserve">1. The ride in.</w:t>
+      </w:r>
+      <w:r>
+        <w:t xml:space="preserve"> </w:t>
+      </w:r>
+      <w:r>
+        <w:t xml:space="preserve">Mercy Springs is a few days’ ride: a trail clock of 4. Run it by</w:t>
+      </w:r>
+      <w:r>
+        <w:t xml:space="preserve"> </w:t>
+      </w:r>
+      <w:r>
+        <w:rPr>
+          <w:iCs/>
+          <w:i/>
+        </w:rPr>
+        <w:t xml:space="preserve">The trail</w:t>
+      </w:r>
+      <w:r>
+        <w:t xml:space="preserve"> </w:t>
+      </w:r>
+      <w:r>
+        <w:t xml:space="preserve">rules in the Players’ Guide. Whatever the hazards are, the last day’s is</w:t>
+      </w:r>
+      <w:r>
+        <w:t xml:space="preserve"> </w:t>
+      </w:r>
+      <w:r>
+        <w:rPr>
+          <w:iCs/>
+          <w:i/>
+        </w:rPr>
+        <w:t xml:space="preserve">Something on the trail</w:t>
+      </w:r>
+      <w:r>
+        <w:t xml:space="preserve">: drag marks leading off toward the hills, and a miner’s boot with the foot still in it. Hunters with the Sight see that the marks were made by hands.</w:t>
       </w:r>
     </w:p>
     <w:p>
@@ -441,13 +423,249 @@
           <w:bCs/>
           <w:b/>
         </w:rPr>
+        <w:t xml:space="preserve">2. Mercy Springs.</w:t>
+      </w:r>
+      <w:r>
+        <w:t xml:space="preserve"> </w:t>
+      </w:r>
+      <w:r>
+        <w:t xml:space="preserve">A silver boomtown gone quiet. Every door is barred by sundown, and dogs won’t go near the mine road. Miners drink in silence at the Silver Dollar; the widows sit together at the back. Sheriff Hiram Vance meets the hunters before they’ve watered their horses. He’s in Crane’s pocket, and tells them there’s no work here. Ezra Quill? The sheriff buried him himself: a cave-in. The letter’s postmark is from last Tuesday.</w:t>
+      </w:r>
+    </w:p>
+    <w:p>
+      <w:pPr>
+        <w:pStyle w:val="BodyText"/>
+      </w:pPr>
+      <w:r>
+        <w:rPr>
+          <w:bCs/>
+          <w:b/>
+        </w:rPr>
+        <w:t xml:space="preserve">3. The digging.</w:t>
+      </w:r>
+      <w:r>
+        <w:t xml:space="preserve"> </w:t>
+      </w:r>
+      <w:r>
+        <w:t xml:space="preserve">Start a discovery clock for the creature, with the Harvest clock ticking beside it (</w:t>
+      </w:r>
+      <w:r>
+        <w:rPr>
+          <w:iCs/>
+          <w:i/>
+        </w:rPr>
+        <w:t xml:space="preserve">Lore cards</w:t>
+      </w:r>
+      <w:r>
+        <w:t xml:space="preserve">, in the Players’ Guide): another miner goes missing each time it fills. The clues, and who finds them best:</w:t>
+      </w:r>
+    </w:p>
+    <w:p>
+      <w:pPr>
+        <w:numPr>
+          <w:ilvl w:val="0"/>
+          <w:numId w:val="1002"/>
+        </w:numPr>
+        <w:pStyle w:val="Compact"/>
+      </w:pPr>
+      <w:r>
+        <w:rPr>
+          <w:bCs/>
+          <w:b/>
+        </w:rPr>
+        <w:t xml:space="preserve">The bodies</w:t>
+      </w:r>
+      <w:r>
+        <w:t xml:space="preserve"> </w:t>
+      </w:r>
+      <w:r>
+        <w:t xml:space="preserve">(Medicine): the wounds were made by teeth, after death. The dead were dragged, not carried, and their fingernails are full of grave dirt that isn’t theirs.</w:t>
+      </w:r>
+    </w:p>
+    <w:p>
+      <w:pPr>
+        <w:numPr>
+          <w:ilvl w:val="0"/>
+          <w:numId w:val="1002"/>
+        </w:numPr>
+        <w:pStyle w:val="Compact"/>
+      </w:pPr>
+      <w:r>
+        <w:rPr>
+          <w:bCs/>
+          <w:b/>
+        </w:rPr>
+        <w:t xml:space="preserve">The graveyard</w:t>
+      </w:r>
+      <w:r>
+        <w:t xml:space="preserve"> </w:t>
+      </w:r>
+      <w:r>
+        <w:t xml:space="preserve">(Investigation, Occult): Quill’s grave is empty, dug out from below. The coffin lid is scratched on the inside. Three older graves have been opened from beneath and emptied.</w:t>
+      </w:r>
+    </w:p>
+    <w:p>
+      <w:pPr>
+        <w:numPr>
+          <w:ilvl w:val="0"/>
+          <w:numId w:val="1002"/>
+        </w:numPr>
+        <w:pStyle w:val="Compact"/>
+      </w:pPr>
+      <w:r>
+        <w:rPr>
+          <w:bCs/>
+          <w:b/>
+        </w:rPr>
+        <w:t xml:space="preserve">The widows</w:t>
+      </w:r>
+      <w:r>
+        <w:t xml:space="preserve"> </w:t>
+      </w:r>
+      <w:r>
+        <w:t xml:space="preserve">(Persuasion, Read People): their men came home with sand in their boots. There’s no sand in a silver mine.</w:t>
+      </w:r>
+    </w:p>
+    <w:p>
+      <w:pPr>
+        <w:numPr>
+          <w:ilvl w:val="0"/>
+          <w:numId w:val="1002"/>
+        </w:numPr>
+        <w:pStyle w:val="Compact"/>
+      </w:pPr>
+      <w:r>
+        <w:rPr>
+          <w:bCs/>
+          <w:b/>
+        </w:rPr>
+        <w:t xml:space="preserve">The church</w:t>
+      </w:r>
+      <w:r>
+        <w:t xml:space="preserve"> </w:t>
+      </w:r>
+      <w:r>
+        <w:t xml:space="preserve">(Occult, or a preacher’s standing): locked, the preacher gone. In his desk, a map of the Lazarus mine’s lowest drift, marked</w:t>
+      </w:r>
+      <w:r>
+        <w:t xml:space="preserve"> </w:t>
+      </w:r>
+      <w:r>
+        <w:rPr>
+          <w:iCs/>
+          <w:i/>
+        </w:rPr>
+        <w:t xml:space="preserve">the old graves</w:t>
+      </w:r>
+      <w:r>
+        <w:t xml:space="preserve">, and a page torn from a hymnal with a warning written in the margin:</w:t>
+      </w:r>
+      <w:r>
+        <w:t xml:space="preserve"> </w:t>
+      </w:r>
+      <w:r>
+        <w:rPr>
+          <w:iCs/>
+          <w:i/>
+        </w:rPr>
+        <w:t xml:space="preserve">they come up where the dead are, and they hate the light.</w:t>
+      </w:r>
+    </w:p>
+    <w:p>
+      <w:pPr>
+        <w:numPr>
+          <w:ilvl w:val="0"/>
+          <w:numId w:val="1002"/>
+        </w:numPr>
+        <w:pStyle w:val="Compact"/>
+      </w:pPr>
+      <w:r>
+        <w:rPr>
+          <w:bCs/>
+          <w:b/>
+        </w:rPr>
+        <w:t xml:space="preserve">The night watch</w:t>
+      </w:r>
+      <w:r>
+        <w:t xml:space="preserve"> </w:t>
+      </w:r>
+      <w:r>
+        <w:t xml:space="preserve">(Stealth, Shooting): a pale thing at a boarding house window, long-armed and quick, and a man in a burial suit shooting at it from the street. Hunters who give chase find a sinkhole behind the livery, and a tunnel going down.</w:t>
+      </w:r>
+    </w:p>
+    <w:p>
+      <w:pPr>
+        <w:pStyle w:val="FirstParagraph"/>
+      </w:pPr>
+      <w:r>
+        <w:t xml:space="preserve">When the Identify phase is done, the hunters know what the creatures are:</w:t>
+      </w:r>
+      <w:r>
+        <w:t xml:space="preserve"> </w:t>
+      </w:r>
+      <w:r>
+        <w:rPr>
+          <w:bCs/>
+          <w:b/>
+        </w:rPr>
+        <w:t xml:space="preserve">ghouls</w:t>
+      </w:r>
+      <w:r>
+        <w:t xml:space="preserve">. They flee daylight and fire, and they drag their dead away. Filling the clock earns a lore card for what the hunters established.</w:t>
+      </w:r>
+    </w:p>
+    <w:p>
+      <w:pPr>
+        <w:pStyle w:val="BodyText"/>
+      </w:pPr>
+      <w:r>
+        <w:rPr>
+          <w:bCs/>
+          <w:b/>
+        </w:rPr>
+        <w:t xml:space="preserve">4. The man in the burial suit.</w:t>
+      </w:r>
+      <w:r>
+        <w:t xml:space="preserve"> </w:t>
+      </w:r>
+      <w:r>
+        <w:t xml:space="preserve">Ezra Quill finds the hunters at midnight, when he rises. He’s been holding the ghouls off on his own, a night at a time, and he’s losing. He knows the mine, and he’ll lead them down. Anyone with the Sight, or who’s dead themselves, knows what he is at a glance; Isaiah Booker knows it in his bones. Quill doesn’t hide it: he rises at the next midnight unless his grave is salted and burned, and he means to keep rising until Crane is in the ground.</w:t>
+      </w:r>
+    </w:p>
+    <w:p>
+      <w:pPr>
+        <w:pStyle w:val="BodyText"/>
+      </w:pPr>
+      <w:r>
+        <w:rPr>
+          <w:bCs/>
+          <w:b/>
+        </w:rPr>
+        <w:t xml:space="preserve">5. The showdown.</w:t>
+      </w:r>
+      <w:r>
+        <w:t xml:space="preserve"> </w:t>
+      </w:r>
+      <w:r>
+        <w:t xml:space="preserve">At noon, Crane’s gunman Cyrus Pruitt (an Outlaw, Will 11) calls out the hunter who’s asked the most questions. Crane wants them gone before they go down the mine. Run it as a showdown. If they kill him with half the town watching, Sheriff Vance calls it murder and Heat marks a box. If the hunters back down, Pruitt follows them to the mine that night, and the ghouls find him first.</w:t>
+      </w:r>
+    </w:p>
+    <w:p>
+      <w:pPr>
+        <w:pStyle w:val="BodyText"/>
+      </w:pPr>
+      <w:r>
+        <w:rPr>
+          <w:bCs/>
+          <w:b/>
+        </w:rPr>
         <w:t xml:space="preserve">6. The Lazarus mine.</w:t>
       </w:r>
       <w:r>
         <w:t xml:space="preserve"> </w:t>
       </w:r>
       <w:r>
-        <w:t xml:space="preserve">The lowest drift opens into the burial cave: three ghouls, plus one more each time the Harvest clock has filled. Fire and lamp oil drive them back; dynamite seals the cave, if someone can light it and get clear. The cave holds the missing miners’ bones, and something older at the back that the hunters don’t have to wake.</w:t>
+        <w:t xml:space="preserve">The lowest drift opens into the burial cave, a place of niches cut in the rock and bones older than any tribe in the territory. There are three ghouls, plus one more for each time the Harvest clock has filled. They fight in the dark and drag the fallen away. Lamps, torches and lamp oil keep them back; a burning drift holds them for a scene. The missing miners are here, what’s left of them. Dynamite seals the cave, if someone can set it and get clear, or the hunters can burn the ghouls out a niche at a time. At the back of the cave, something older is sleeping under the stones. The hunters don’t have to wake it, but someone may want to come back.</w:t>
       </w:r>
     </w:p>
     <w:p>
@@ -465,7 +683,7 @@
         <w:t xml:space="preserve"> </w:t>
       </w:r>
       <w:r>
-        <w:t xml:space="preserve">Quill comes for Crane, and Crane’s two hired guns stand in his way. The hunters choose: help a dead man take his revenge, stand aside, or stop him. Ruth’s badge says Crane should hang by the law, and Quill doesn’t believe the law will do it. Whatever they choose, Crane’s confession, or his ledger, can clear any Heat from the showdown, and stopping Quill means salting and burning his grave before the next midnight.</w:t>
+        <w:t xml:space="preserve">With the ghouls finished, Quill goes for Crane, and Crane’s two hired guns stand in his way. The hunters choose: help a dead man take his revenge, stand aside, or stop him. Ruth Calloway’s badge says Crane should hang by the law; Quill doesn’t believe the law will do it. Crane’s ledger in his safe shows the payments to the sheriff and the order on Quill. Stopping Quill for good means salting and burning his grave before the next midnight, and he knows it.</w:t>
       </w:r>
     </w:p>
     <w:p>
@@ -483,7 +701,7 @@
         <w:t xml:space="preserve"> </w:t>
       </w:r>
       <w:r>
-        <w:t xml:space="preserve">The $50 drafts, and whatever Crane’s safe holds. A lore card on ghouls, and one on revenants for whoever salts the grave. If the mine is sealed, the town remembers the hunters well: clear a box of Whispers. If Quill got his revenge in the open, mark one.</w:t>
+        <w:t xml:space="preserve">The $50 drafts, and whatever Crane’s safe holds. A lore card on ghouls, and another on revenants if the hunters learned how one is laid to rest. If the mine is sealed, Mercy Springs remembers the hunters well: clear a box of Whispers. If the ghouls were seen in the street, mark one. And something still sleeps at the back of the cave, so The Dark marks a box.</w:t>
       </w:r>
     </w:p>
     <w:p>
@@ -3388,7 +3606,7 @@
       <w:pPr>
         <w:numPr>
           <w:ilvl w:val="0"/>
-          <w:numId w:val="1002"/>
+          <w:numId w:val="1003"/>
         </w:numPr>
         <w:pStyle w:val="Compact"/>
       </w:pPr>
@@ -3420,155 +3638,6 @@
       </w:r>
       <w:r>
         <w:t xml:space="preserve">clock, ticking each hour. A successful Medicine roll with an Occult remedy stops it; when it fills, you die, and rise.</w:t>
-      </w:r>
-    </w:p>
-    <w:p>
-      <w:pPr>
-        <w:numPr>
-          <w:ilvl w:val="0"/>
-          <w:numId w:val="1002"/>
-        </w:numPr>
-        <w:pStyle w:val="Compact"/>
-      </w:pPr>
-      <w:r>
-        <w:rPr>
-          <w:bCs/>
-          <w:b/>
-        </w:rPr>
-        <w:t xml:space="preserve">Werewolf bite.</w:t>
-      </w:r>
-      <w:r>
-        <w:t xml:space="preserve"> </w:t>
-      </w:r>
-      <w:r>
-        <w:t xml:space="preserve">A bite under the full moon can pass on the curse; the GM decides, and lifting it is a major ritual.</w:t>
-      </w:r>
-    </w:p>
-    <w:p>
-      <w:pPr>
-        <w:numPr>
-          <w:ilvl w:val="0"/>
-          <w:numId w:val="1002"/>
-        </w:numPr>
-        <w:pStyle w:val="Compact"/>
-      </w:pPr>
-      <w:r>
-        <w:rPr>
-          <w:bCs/>
-          <w:b/>
-        </w:rPr>
-        <w:t xml:space="preserve">Vampire bite.</w:t>
-      </w:r>
-      <w:r>
-        <w:t xml:space="preserve"> </w:t>
-      </w:r>
-      <w:r>
-        <w:t xml:space="preserve">A vampire who drains a victim to Dying can choose to turn them. The turned belong to its lineage (see</w:t>
-      </w:r>
-      <w:r>
-        <w:t xml:space="preserve"> </w:t>
-      </w:r>
-      <w:r>
-        <w:rPr>
-          <w:iCs/>
-          <w:i/>
-        </w:rPr>
-        <w:t xml:space="preserve">Vampires</w:t>
-      </w:r>
-      <w:r>
-        <w:t xml:space="preserve">).</w:t>
-      </w:r>
-    </w:p>
-    <w:p>
-      <w:pPr>
-        <w:numPr>
-          <w:ilvl w:val="0"/>
-          <w:numId w:val="1002"/>
-        </w:numPr>
-        <w:pStyle w:val="Compact"/>
-      </w:pPr>
-      <w:r>
-        <w:rPr>
-          <w:bCs/>
-          <w:b/>
-        </w:rPr>
-        <w:t xml:space="preserve">The wendigo’s hunger.</w:t>
-      </w:r>
-      <w:r>
-        <w:t xml:space="preserve"> </w:t>
-      </w:r>
-      <w:r>
-        <w:t xml:space="preserve">It begins with someone who ate human flesh to survive a starving winter in the high passes. A character who does starts a 4-segment</w:t>
-      </w:r>
-      <w:r>
-        <w:t xml:space="preserve"> </w:t>
-      </w:r>
-      <w:r>
-        <w:rPr>
-          <w:bCs/>
-          <w:b/>
-        </w:rPr>
-        <w:t xml:space="preserve">Hunger</w:t>
-      </w:r>
-      <w:r>
-        <w:t xml:space="preserve"> </w:t>
-      </w:r>
-      <w:r>
-        <w:t xml:space="preserve">clock, ticking each week they go without it again; when it fills, they belong to the wendigo. Only a major ritual lifts it.</w:t>
-      </w:r>
-    </w:p>
-    <w:p>
-      <w:pPr>
-        <w:numPr>
-          <w:ilvl w:val="0"/>
-          <w:numId w:val="1002"/>
-        </w:numPr>
-        <w:pStyle w:val="Compact"/>
-      </w:pPr>
-      <w:r>
-        <w:rPr>
-          <w:bCs/>
-          <w:b/>
-        </w:rPr>
-        <w:t xml:space="preserve">A wraith’s touch.</w:t>
-      </w:r>
-      <w:r>
-        <w:t xml:space="preserve"> </w:t>
-      </w:r>
-      <w:r>
-        <w:t xml:space="preserve">Someone killed by it rises as a wraith at the next new moon, unless they’re buried with salt in the coffin.</w:t>
-      </w:r>
-    </w:p>
-    <w:p>
-      <w:pPr>
-        <w:numPr>
-          <w:ilvl w:val="0"/>
-          <w:numId w:val="1002"/>
-        </w:numPr>
-        <w:pStyle w:val="Compact"/>
-      </w:pPr>
-      <w:r>
-        <w:rPr>
-          <w:bCs/>
-          <w:b/>
-        </w:rPr>
-        <w:t xml:space="preserve">A banshee’s keening.</w:t>
-      </w:r>
-      <w:r>
-        <w:t xml:space="preserve"> </w:t>
-      </w:r>
-      <w:r>
-        <w:t xml:space="preserve">She is tied to a family’s blood, not a place: once she has keened for one of a line, she can follow that family from town to town.</w:t>
-      </w:r>
-    </w:p>
-    <w:bookmarkEnd w:id="25"/>
-    <w:bookmarkStart w:id="26" w:name="vampires"/>
-    <w:p>
-      <w:pPr>
-        <w:pStyle w:val="Heading2"/>
-      </w:pPr>
-      <w:r>
-        <w:t xml:space="preserve">Vampires</w:t>
       </w:r>
     </w:p>
     <w:p>
@@ -3584,29 +3653,13 @@
           <w:bCs/>
           <w:b/>
         </w:rPr>
-        <w:t xml:space="preserve">Lineages.</w:t>
-      </w:r>
-      <w:r>
-        <w:t xml:space="preserve"> </w:t>
-      </w:r>
-      <w:r>
-        <w:t xml:space="preserve">Each</w:t>
-      </w:r>
-      <w:r>
-        <w:t xml:space="preserve"> </w:t>
-      </w:r>
-      <w:r>
-        <w:rPr>
-          <w:bCs/>
-          <w:b/>
-        </w:rPr>
-        <w:t xml:space="preserve">natural vampire</w:t>
-      </w:r>
-      <w:r>
-        <w:t xml:space="preserve"> </w:t>
-      </w:r>
-      <w:r>
-        <w:t xml:space="preserve">sustains its own lineage: everyone it has turned, and everyone they have turned in turn. There is more than one natural vampire.</w:t>
+        <w:t xml:space="preserve">Werewolf bite.</w:t>
+      </w:r>
+      <w:r>
+        <w:t xml:space="preserve"> </w:t>
+      </w:r>
+      <w:r>
+        <w:t xml:space="preserve">A bite under the full moon can pass on the curse; the GM decides, and lifting it is a major ritual.</w:t>
       </w:r>
     </w:p>
     <w:p>
@@ -3622,13 +3675,26 @@
           <w:bCs/>
           <w:b/>
         </w:rPr>
-        <w:t xml:space="preserve">Freeing a lineage.</w:t>
-      </w:r>
-      <w:r>
-        <w:t xml:space="preserve"> </w:t>
-      </w:r>
-      <w:r>
-        <w:t xml:space="preserve">Destroy the natural source, and the whole chain reverts to human, including those infected only indirectly. Destroying a vampire it turned (an intermediate) cures nobody.</w:t>
+        <w:t xml:space="preserve">Vampire bite.</w:t>
+      </w:r>
+      <w:r>
+        <w:t xml:space="preserve"> </w:t>
+      </w:r>
+      <w:r>
+        <w:t xml:space="preserve">A vampire who drains a victim to Dying can choose to turn them. The turned belong to its lineage (see</w:t>
+      </w:r>
+      <w:r>
+        <w:t xml:space="preserve"> </w:t>
+      </w:r>
+      <w:r>
+        <w:rPr>
+          <w:iCs/>
+          <w:i/>
+        </w:rPr>
+        <w:t xml:space="preserve">Vampires</w:t>
+      </w:r>
+      <w:r>
+        <w:t xml:space="preserve">).</w:t>
       </w:r>
     </w:p>
     <w:p>
@@ -3644,13 +3710,29 @@
           <w:bCs/>
           <w:b/>
         </w:rPr>
-        <w:t xml:space="preserve">A stake isn’t the end.</w:t>
-      </w:r>
-      <w:r>
-        <w:t xml:space="preserve"> </w:t>
-      </w:r>
-      <w:r>
-        <w:t xml:space="preserve">A stake through the heart incapacitates a vampire; it doesn’t destroy it. Staking the source doesn’t free its lineage; destroying it does.</w:t>
+        <w:t xml:space="preserve">The wendigo’s hunger.</w:t>
+      </w:r>
+      <w:r>
+        <w:t xml:space="preserve"> </w:t>
+      </w:r>
+      <w:r>
+        <w:t xml:space="preserve">It begins with someone who ate human flesh to survive a starving winter in the high passes. A character who does starts a 4-segment</w:t>
+      </w:r>
+      <w:r>
+        <w:t xml:space="preserve"> </w:t>
+      </w:r>
+      <w:r>
+        <w:rPr>
+          <w:bCs/>
+          <w:b/>
+        </w:rPr>
+        <w:t xml:space="preserve">Hunger</w:t>
+      </w:r>
+      <w:r>
+        <w:t xml:space="preserve"> </w:t>
+      </w:r>
+      <w:r>
+        <w:t xml:space="preserve">clock, ticking each week they go without it again; when it fills, they belong to the wendigo. Only a major ritual lifts it.</w:t>
       </w:r>
     </w:p>
     <w:p>
@@ -3666,13 +3748,13 @@
           <w:bCs/>
           <w:b/>
         </w:rPr>
-        <w:t xml:space="preserve">What reversion does to the body.</w:t>
-      </w:r>
-      <w:r>
-        <w:t xml:space="preserve"> </w:t>
-      </w:r>
-      <w:r>
-        <w:t xml:space="preserve">Wounds that vampiric regeneration already healed stay healed. Wounds that hadn’t healed remain, and have their ordinary human consequences at once: someone reverting with three boxes marked is Dying. Reversion itself repairs nothing.</w:t>
+        <w:t xml:space="preserve">A wraith’s touch.</w:t>
+      </w:r>
+      <w:r>
+        <w:t xml:space="preserve"> </w:t>
+      </w:r>
+      <w:r>
+        <w:t xml:space="preserve">Someone killed by it rises as a wraith at the next new moon, unless they’re buried with salt in the coffin.</w:t>
       </w:r>
     </w:p>
     <w:p>
@@ -3684,17 +3766,27 @@
         <w:pStyle w:val="Compact"/>
       </w:pPr>
       <w:r>
-        <w:t xml:space="preserve">This cure is a vampire’s alone: no other creature’s victims are freed by killing their maker.</w:t>
-      </w:r>
-    </w:p>
-    <w:bookmarkEnd w:id="26"/>
-    <w:bookmarkStart w:id="27" w:name="the-wendigo"/>
+        <w:rPr>
+          <w:bCs/>
+          <w:b/>
+        </w:rPr>
+        <w:t xml:space="preserve">A banshee’s keening.</w:t>
+      </w:r>
+      <w:r>
+        <w:t xml:space="preserve"> </w:t>
+      </w:r>
+      <w:r>
+        <w:t xml:space="preserve">She is tied to a family’s blood, not a place: once she has keened for one of a line, she can follow that family from town to town.</w:t>
+      </w:r>
+    </w:p>
+    <w:bookmarkEnd w:id="25"/>
+    <w:bookmarkStart w:id="26" w:name="vampires"/>
     <w:p>
       <w:pPr>
         <w:pStyle w:val="Heading2"/>
       </w:pPr>
       <w:r>
-        <w:t xml:space="preserve">The wendigo</w:t>
+        <w:t xml:space="preserve">Vampires</w:t>
       </w:r>
     </w:p>
     <w:p>
@@ -3706,7 +3798,33 @@
         <w:pStyle w:val="Compact"/>
       </w:pPr>
       <w:r>
-        <w:t xml:space="preserve">Ordinary weapons wound it; only fire marks more than 1 box at a time.</w:t>
+        <w:rPr>
+          <w:bCs/>
+          <w:b/>
+        </w:rPr>
+        <w:t xml:space="preserve">Lineages.</w:t>
+      </w:r>
+      <w:r>
+        <w:t xml:space="preserve"> </w:t>
+      </w:r>
+      <w:r>
+        <w:t xml:space="preserve">Each</w:t>
+      </w:r>
+      <w:r>
+        <w:t xml:space="preserve"> </w:t>
+      </w:r>
+      <w:r>
+        <w:rPr>
+          <w:bCs/>
+          <w:b/>
+        </w:rPr>
+        <w:t xml:space="preserve">natural vampire</w:t>
+      </w:r>
+      <w:r>
+        <w:t xml:space="preserve"> </w:t>
+      </w:r>
+      <w:r>
+        <w:t xml:space="preserve">sustains its own lineage: everyone it has turned, and everyone they have turned in turn. There is more than one natural vampire.</w:t>
       </w:r>
     </w:p>
     <w:p>
@@ -3718,7 +3836,17 @@
         <w:pStyle w:val="Compact"/>
       </w:pPr>
       <w:r>
-        <w:t xml:space="preserve">It heals unnaturally fast, and only fire interferes with that healing.</w:t>
+        <w:rPr>
+          <w:bCs/>
+          <w:b/>
+        </w:rPr>
+        <w:t xml:space="preserve">Freeing a lineage.</w:t>
+      </w:r>
+      <w:r>
+        <w:t xml:space="preserve"> </w:t>
+      </w:r>
+      <w:r>
+        <w:t xml:space="preserve">Destroy the natural source, and the whole chain reverts to human, including those infected only indirectly. Destroying a vampire it turned (an intermediate) cures nobody.</w:t>
       </w:r>
     </w:p>
     <w:p>
@@ -3730,20 +3858,17 @@
         <w:pStyle w:val="Compact"/>
       </w:pPr>
       <w:r>
-        <w:t xml:space="preserve">It is destroyed for good only when it is</w:t>
-      </w:r>
-      <w:r>
-        <w:t xml:space="preserve"> </w:t>
-      </w:r>
-      <w:r>
-        <w:rPr>
-          <w:bCs/>
-          <w:b/>
-        </w:rPr>
-        <w:t xml:space="preserve">beheaded and its body burned</w:t>
-      </w:r>
-      <w:r>
-        <w:t xml:space="preserve">. After beheading, the body can still lash out, but blindly: its actions have no direction.</w:t>
+        <w:rPr>
+          <w:bCs/>
+          <w:b/>
+        </w:rPr>
+        <w:t xml:space="preserve">A stake isn’t the end.</w:t>
+      </w:r>
+      <w:r>
+        <w:t xml:space="preserve"> </w:t>
+      </w:r>
+      <w:r>
+        <w:t xml:space="preserve">A stake through the heart incapacitates a vampire; it doesn’t destroy it. Staking the source doesn’t free its lineage; destroying it does.</w:t>
       </w:r>
     </w:p>
     <w:p>
@@ -3755,17 +3880,39 @@
         <w:pStyle w:val="Compact"/>
       </w:pPr>
       <w:r>
-        <w:t xml:space="preserve">How fast it heals, how long fire holds the healing back, and how the headless body’s blind attacks are run are not yet set; until they are, the GM rules.</w:t>
-      </w:r>
-    </w:p>
-    <w:bookmarkEnd w:id="27"/>
-    <w:bookmarkStart w:id="28" w:name="hellhounds"/>
+        <w:rPr>
+          <w:bCs/>
+          <w:b/>
+        </w:rPr>
+        <w:t xml:space="preserve">What reversion does to the body.</w:t>
+      </w:r>
+      <w:r>
+        <w:t xml:space="preserve"> </w:t>
+      </w:r>
+      <w:r>
+        <w:t xml:space="preserve">Wounds that vampiric regeneration already healed stay healed. Wounds that hadn’t healed remain, and have their ordinary human consequences at once: someone reverting with three boxes marked is Dying. Reversion itself repairs nothing.</w:t>
+      </w:r>
+    </w:p>
+    <w:p>
+      <w:pPr>
+        <w:numPr>
+          <w:ilvl w:val="0"/>
+          <w:numId w:val="1004"/>
+        </w:numPr>
+        <w:pStyle w:val="Compact"/>
+      </w:pPr>
+      <w:r>
+        <w:t xml:space="preserve">This cure is a vampire’s alone: no other creature’s victims are freed by killing their maker.</w:t>
+      </w:r>
+    </w:p>
+    <w:bookmarkEnd w:id="26"/>
+    <w:bookmarkStart w:id="27" w:name="the-wendigo"/>
     <w:p>
       <w:pPr>
         <w:pStyle w:val="Heading2"/>
       </w:pPr>
       <w:r>
-        <w:t xml:space="preserve">Hellhounds</w:t>
+        <w:t xml:space="preserve">The wendigo</w:t>
       </w:r>
     </w:p>
     <w:p>
@@ -3777,20 +3924,7 @@
         <w:pStyle w:val="Compact"/>
       </w:pPr>
       <w:r>
-        <w:t xml:space="preserve">A hellhound’s hunt is a</w:t>
-      </w:r>
-      <w:r>
-        <w:t xml:space="preserve"> </w:t>
-      </w:r>
-      <w:r>
-        <w:rPr>
-          <w:bCs/>
-          <w:b/>
-        </w:rPr>
-        <w:t xml:space="preserve">curse tied to a claim on someone’s soul</w:t>
-      </w:r>
-      <w:r>
-        <w:t xml:space="preserve">.</w:t>
+        <w:t xml:space="preserve">Ordinary weapons wound it; only fire marks more than 1 box at a time.</w:t>
       </w:r>
     </w:p>
     <w:p>
@@ -3802,33 +3936,7 @@
         <w:pStyle w:val="Compact"/>
       </w:pPr>
       <w:r>
-        <w:t xml:space="preserve">The hunt ends only when the conditions behind the claim are</w:t>
-      </w:r>
-      <w:r>
-        <w:t xml:space="preserve"> </w:t>
-      </w:r>
-      <w:r>
-        <w:rPr>
-          <w:bCs/>
-          <w:b/>
-        </w:rPr>
-        <w:t xml:space="preserve">resolved or changed</w:t>
-      </w:r>
-      <w:r>
-        <w:t xml:space="preserve">. A powerful practitioner can interfere with the pact through a</w:t>
-      </w:r>
-      <w:r>
-        <w:t xml:space="preserve"> </w:t>
-      </w:r>
-      <w:r>
-        <w:rPr>
-          <w:bCs/>
-          <w:b/>
-        </w:rPr>
-        <w:t xml:space="preserve">major ritual</w:t>
-      </w:r>
-      <w:r>
-        <w:t xml:space="preserve">.</w:t>
+        <w:t xml:space="preserve">It heals unnaturally fast, and only fire interferes with that healing.</w:t>
       </w:r>
     </w:p>
     <w:p>
@@ -3840,17 +3948,20 @@
         <w:pStyle w:val="Compact"/>
       </w:pPr>
       <w:r>
-        <w:rPr>
-          <w:bCs/>
-          <w:b/>
-        </w:rPr>
-        <w:t xml:space="preserve">Holy water</w:t>
-      </w:r>
-      <w:r>
-        <w:t xml:space="preserve"> </w:t>
-      </w:r>
-      <w:r>
-        <w:t xml:space="preserve">drives a hellhound off and protects its quarry for a time; it doesn’t cancel the pact.</w:t>
+        <w:t xml:space="preserve">It is destroyed for good only when it is</w:t>
+      </w:r>
+      <w:r>
+        <w:t xml:space="preserve"> </w:t>
+      </w:r>
+      <w:r>
+        <w:rPr>
+          <w:bCs/>
+          <w:b/>
+        </w:rPr>
+        <w:t xml:space="preserve">beheaded and its body burned</w:t>
+      </w:r>
+      <w:r>
+        <w:t xml:space="preserve">. After beheading, the body can still lash out, but blindly: its actions have no direction.</w:t>
       </w:r>
     </w:p>
     <w:p>
@@ -3862,99 +3973,17 @@
         <w:pStyle w:val="Compact"/>
       </w:pPr>
       <w:r>
-        <w:t xml:space="preserve">Whether destroying a hellhound’s physical body buys the quarry time, and how much, is not settled: the GM rules case by case.</w:t>
-      </w:r>
-    </w:p>
-    <w:bookmarkEnd w:id="28"/>
-    <w:bookmarkStart w:id="29" w:name="the-shadow-realm"/>
+        <w:t xml:space="preserve">How fast it heals, how long fire holds the healing back, and how the headless body’s blind attacks are run are not yet set; until they are, the GM rules.</w:t>
+      </w:r>
+    </w:p>
+    <w:bookmarkEnd w:id="27"/>
+    <w:bookmarkStart w:id="28" w:name="hellhounds"/>
     <w:p>
       <w:pPr>
         <w:pStyle w:val="Heading2"/>
       </w:pPr>
       <w:r>
-        <w:t xml:space="preserve">The shadow realm</w:t>
-      </w:r>
-    </w:p>
-    <w:p>
-      <w:pPr>
-        <w:pStyle w:val="FirstParagraph"/>
-      </w:pPr>
-      <w:r>
-        <w:t xml:space="preserve">The</w:t>
-      </w:r>
-      <w:r>
-        <w:t xml:space="preserve"> </w:t>
-      </w:r>
-      <w:r>
-        <w:rPr>
-          <w:bCs/>
-          <w:b/>
-        </w:rPr>
-        <w:t xml:space="preserve">shadow realm</w:t>
-      </w:r>
-      <w:r>
-        <w:t xml:space="preserve"> </w:t>
-      </w:r>
-      <w:r>
-        <w:t xml:space="preserve">is a real place in the same world as ours, not another Earth: it has no copies of our towns or our people. It is an independent and brutal ecology, with its own hunters and prey. Some of its creatures cross over, and some of those spread a</w:t>
-      </w:r>
-      <w:r>
-        <w:t xml:space="preserve"> </w:t>
-      </w:r>
-      <w:r>
-        <w:rPr>
-          <w:bCs/>
-          <w:b/>
-        </w:rPr>
-        <w:t xml:space="preserve">contagion</w:t>
-      </w:r>
-      <w:r>
-        <w:t xml:space="preserve"> </w:t>
-      </w:r>
-      <w:r>
-        <w:t xml:space="preserve">(a bite, a curse) that makes more of their kind; others never do. Each threat has its own weaknesses, found out on their own terms: not every horror is an infection.</w:t>
-      </w:r>
-    </w:p>
-    <w:p>
-      <w:pPr>
-        <w:pStyle w:val="BodyText"/>
-      </w:pPr>
-      <w:r>
-        <w:t xml:space="preserve">Some hold that the things of the dark are</w:t>
-      </w:r>
-      <w:r>
-        <w:t xml:space="preserve"> </w:t>
-      </w:r>
-      <w:r>
-        <w:rPr>
-          <w:bCs/>
-          <w:b/>
-        </w:rPr>
-        <w:t xml:space="preserve">fallen angels</w:t>
-      </w:r>
-      <w:r>
-        <w:t xml:space="preserve"> </w:t>
-      </w:r>
-      <w:r>
-        <w:t xml:space="preserve">and their brood. Others call that a preacher’s story. No one has settled it, and the game doesn’t.</w:t>
-      </w:r>
-    </w:p>
-    <w:bookmarkEnd w:id="29"/>
-    <w:bookmarkStart w:id="30" w:name="demons"/>
-    <w:p>
-      <w:pPr>
-        <w:pStyle w:val="Heading2"/>
-      </w:pPr>
-      <w:r>
-        <w:t xml:space="preserve">Demons</w:t>
-      </w:r>
-    </w:p>
-    <w:p>
-      <w:pPr>
-        <w:pStyle w:val="FirstParagraph"/>
-      </w:pPr>
-      <w:r>
-        <w:t xml:space="preserve">Three kinds of thing get called a demon, and they aren’t the same:</w:t>
+        <w:t xml:space="preserve">Hellhounds</w:t>
       </w:r>
     </w:p>
     <w:p>
@@ -3966,17 +3995,20 @@
         <w:pStyle w:val="Compact"/>
       </w:pPr>
       <w:r>
-        <w:rPr>
-          <w:bCs/>
-          <w:b/>
-        </w:rPr>
-        <w:t xml:space="preserve">Demonic creatures</w:t>
-      </w:r>
-      <w:r>
-        <w:t xml:space="preserve"> </w:t>
-      </w:r>
-      <w:r>
-        <w:t xml:space="preserve">native to the shadow realm: beasts and hunters of that ecology.</w:t>
+        <w:t xml:space="preserve">A hellhound’s hunt is a</w:t>
+      </w:r>
+      <w:r>
+        <w:t xml:space="preserve"> </w:t>
+      </w:r>
+      <w:r>
+        <w:rPr>
+          <w:bCs/>
+          <w:b/>
+        </w:rPr>
+        <w:t xml:space="preserve">curse tied to a claim on someone’s soul</w:t>
+      </w:r>
+      <w:r>
+        <w:t xml:space="preserve">.</w:t>
       </w:r>
     </w:p>
     <w:p>
@@ -3988,14 +4020,33 @@
         <w:pStyle w:val="Compact"/>
       </w:pPr>
       <w:r>
-        <w:rPr>
-          <w:bCs/>
-          <w:b/>
-        </w:rPr>
-        <w:t xml:space="preserve">Creatures under demonic influence</w:t>
-      </w:r>
-      <w:r>
-        <w:t xml:space="preserve">: something, or someone, bent by a demon’s power.</w:t>
+        <w:t xml:space="preserve">The hunt ends only when the conditions behind the claim are</w:t>
+      </w:r>
+      <w:r>
+        <w:t xml:space="preserve"> </w:t>
+      </w:r>
+      <w:r>
+        <w:rPr>
+          <w:bCs/>
+          <w:b/>
+        </w:rPr>
+        <w:t xml:space="preserve">resolved or changed</w:t>
+      </w:r>
+      <w:r>
+        <w:t xml:space="preserve">. A powerful practitioner can interfere with the pact through a</w:t>
+      </w:r>
+      <w:r>
+        <w:t xml:space="preserve"> </w:t>
+      </w:r>
+      <w:r>
+        <w:rPr>
+          <w:bCs/>
+          <w:b/>
+        </w:rPr>
+        <w:t xml:space="preserve">major ritual</w:t>
+      </w:r>
+      <w:r>
+        <w:t xml:space="preserve">.</w:t>
       </w:r>
     </w:p>
     <w:p>
@@ -4011,23 +4062,35 @@
           <w:bCs/>
           <w:b/>
         </w:rPr>
-        <w:t xml:space="preserve">True demons</w:t>
-      </w:r>
-      <w:r>
-        <w:t xml:space="preserve">, native to the deeper</w:t>
-      </w:r>
-      <w:r>
-        <w:t xml:space="preserve"> </w:t>
-      </w:r>
-      <w:r>
-        <w:rPr>
-          <w:bCs/>
-          <w:b/>
-        </w:rPr>
-        <w:t xml:space="preserve">Abyss</w:t>
-      </w:r>
-      <w:r>
-        <w:t xml:space="preserve">: a realm of no light and of eldritch powers, not a fiery hell. A true demon isn’t a creature of fire.</w:t>
+        <w:t xml:space="preserve">Holy water</w:t>
+      </w:r>
+      <w:r>
+        <w:t xml:space="preserve"> </w:t>
+      </w:r>
+      <w:r>
+        <w:t xml:space="preserve">drives a hellhound off and protects its quarry for a time; it doesn’t cancel the pact.</w:t>
+      </w:r>
+    </w:p>
+    <w:p>
+      <w:pPr>
+        <w:numPr>
+          <w:ilvl w:val="0"/>
+          <w:numId w:val="1006"/>
+        </w:numPr>
+        <w:pStyle w:val="Compact"/>
+      </w:pPr>
+      <w:r>
+        <w:t xml:space="preserve">Whether destroying a hellhound’s physical body buys the quarry time, and how much, is not settled: the GM rules case by case.</w:t>
+      </w:r>
+    </w:p>
+    <w:bookmarkEnd w:id="28"/>
+    <w:bookmarkStart w:id="29" w:name="the-shadow-realm"/>
+    <w:p>
+      <w:pPr>
+        <w:pStyle w:val="Heading2"/>
+      </w:pPr>
+      <w:r>
+        <w:t xml:space="preserve">The shadow realm</w:t>
       </w:r>
     </w:p>
     <w:p>
@@ -4035,59 +4098,81 @@
         <w:pStyle w:val="FirstParagraph"/>
       </w:pPr>
       <w:r>
-        <w:t xml:space="preserve">A</w:t>
-      </w:r>
-      <w:r>
-        <w:t xml:space="preserve"> </w:t>
-      </w:r>
-      <w:r>
-        <w:rPr>
-          <w:bCs/>
-          <w:b/>
-        </w:rPr>
-        <w:t xml:space="preserve">true demon can’t enter our world unaided</w:t>
-      </w:r>
-      <w:r>
-        <w:t xml:space="preserve">: it must be</w:t>
-      </w:r>
-      <w:r>
-        <w:t xml:space="preserve"> </w:t>
-      </w:r>
-      <w:r>
-        <w:rPr>
-          <w:bCs/>
-          <w:b/>
-        </w:rPr>
-        <w:t xml:space="preserve">summoned</w:t>
-      </w:r>
-      <w:r>
-        <w:t xml:space="preserve">, or come through a</w:t>
-      </w:r>
-      <w:r>
-        <w:t xml:space="preserve"> </w:t>
-      </w:r>
-      <w:r>
-        <w:rPr>
-          <w:bCs/>
-          <w:b/>
-        </w:rPr>
-        <w:t xml:space="preserve">possession</w:t>
-      </w:r>
-      <w:r>
-        <w:t xml:space="preserve">. A person can be possessed only if they are corrupted and have no faith of any kind at all. True demons are exceptionally powerful, and a generic fight is not how they are met: the encounter is a</w:t>
-      </w:r>
-      <w:r>
-        <w:t xml:space="preserve"> </w:t>
-      </w:r>
-      <w:r>
-        <w:rPr>
-          <w:bCs/>
-          <w:b/>
-        </w:rPr>
-        <w:t xml:space="preserve">ritual or a negotiation</w:t>
-      </w:r>
-      <w:r>
-        <w:t xml:space="preserve">, and the countermeasures are major rituals and powerful holy talismans.</w:t>
+        <w:t xml:space="preserve">The</w:t>
+      </w:r>
+      <w:r>
+        <w:t xml:space="preserve"> </w:t>
+      </w:r>
+      <w:r>
+        <w:rPr>
+          <w:bCs/>
+          <w:b/>
+        </w:rPr>
+        <w:t xml:space="preserve">shadow realm</w:t>
+      </w:r>
+      <w:r>
+        <w:t xml:space="preserve"> </w:t>
+      </w:r>
+      <w:r>
+        <w:t xml:space="preserve">is a real place in the same world as ours, not another Earth: it has no copies of our towns or our people. It is an independent and brutal ecology, with its own hunters and prey. Some of its creatures cross over, and some of those spread a</w:t>
+      </w:r>
+      <w:r>
+        <w:t xml:space="preserve"> </w:t>
+      </w:r>
+      <w:r>
+        <w:rPr>
+          <w:bCs/>
+          <w:b/>
+        </w:rPr>
+        <w:t xml:space="preserve">contagion</w:t>
+      </w:r>
+      <w:r>
+        <w:t xml:space="preserve"> </w:t>
+      </w:r>
+      <w:r>
+        <w:t xml:space="preserve">(a bite, a curse) that makes more of their kind; others never do. Each threat has its own weaknesses, found out on their own terms: not every horror is an infection.</w:t>
+      </w:r>
+    </w:p>
+    <w:p>
+      <w:pPr>
+        <w:pStyle w:val="BodyText"/>
+      </w:pPr>
+      <w:r>
+        <w:t xml:space="preserve">Some hold that the things of the dark are</w:t>
+      </w:r>
+      <w:r>
+        <w:t xml:space="preserve"> </w:t>
+      </w:r>
+      <w:r>
+        <w:rPr>
+          <w:bCs/>
+          <w:b/>
+        </w:rPr>
+        <w:t xml:space="preserve">fallen angels</w:t>
+      </w:r>
+      <w:r>
+        <w:t xml:space="preserve"> </w:t>
+      </w:r>
+      <w:r>
+        <w:t xml:space="preserve">and their brood. Others call that a preacher’s story. No one has settled it, and the game doesn’t.</w:t>
+      </w:r>
+    </w:p>
+    <w:bookmarkEnd w:id="29"/>
+    <w:bookmarkStart w:id="30" w:name="demons"/>
+    <w:p>
+      <w:pPr>
+        <w:pStyle w:val="Heading2"/>
+      </w:pPr>
+      <w:r>
+        <w:t xml:space="preserve">Demons</w:t>
+      </w:r>
+    </w:p>
+    <w:p>
+      <w:pPr>
+        <w:pStyle w:val="FirstParagraph"/>
+      </w:pPr>
+      <w:r>
+        <w:t xml:space="preserve">Three kinds of thing get called a demon, and they aren’t the same:</w:t>
       </w:r>
     </w:p>
     <w:p>
@@ -4103,13 +4188,13 @@
           <w:bCs/>
           <w:b/>
         </w:rPr>
-        <w:t xml:space="preserve">Banishment by a talisman.</w:t>
-      </w:r>
-      <w:r>
-        <w:t xml:space="preserve"> </w:t>
-      </w:r>
-      <w:r>
-        <w:t xml:space="preserve">A sufficiently powerful holy talisman can banish a demon by breaking its binding to our world. What happens to the host depends on the talisman and how it acts: a holy sword that fatally wounds the host banishes the demon and kills the host.</w:t>
+        <w:t xml:space="preserve">Demonic creatures</w:t>
+      </w:r>
+      <w:r>
+        <w:t xml:space="preserve"> </w:t>
+      </w:r>
+      <w:r>
+        <w:t xml:space="preserve">native to the shadow realm: beasts and hunters of that ecology.</w:t>
       </w:r>
     </w:p>
     <w:p>
@@ -4125,13 +4210,10 @@
           <w:bCs/>
           <w:b/>
         </w:rPr>
-        <w:t xml:space="preserve">Banishment by ritual.</w:t>
-      </w:r>
-      <w:r>
-        <w:t xml:space="preserve"> </w:t>
-      </w:r>
-      <w:r>
-        <w:t xml:space="preserve">A properly completed banishment ritual preserves the host, if their body can survive without the demon holding it up.</w:t>
+        <w:t xml:space="preserve">Creatures under demonic influence</w:t>
+      </w:r>
+      <w:r>
+        <w:t xml:space="preserve">: something, or someone, bent by a demon’s power.</w:t>
       </w:r>
     </w:p>
     <w:p>
@@ -4147,20 +4229,156 @@
           <w:bCs/>
           <w:b/>
         </w:rPr>
-        <w:t xml:space="preserve">A possessed body.</w:t>
-      </w:r>
-      <w:r>
-        <w:t xml:space="preserve"> </w:t>
-      </w:r>
-      <w:r>
-        <w:t xml:space="preserve">A demon can keep a body moving through wounds that would otherwise be fatal, but possession heals nothing and grows nothing back. Ordinary injury to the body doesn’t kill the demon. This is not a vampire’s regeneration: when the demon goes, the body’s wounds are all still there.</w:t>
+        <w:t xml:space="preserve">True demons</w:t>
+      </w:r>
+      <w:r>
+        <w:t xml:space="preserve">, native to the deeper</w:t>
+      </w:r>
+      <w:r>
+        <w:t xml:space="preserve"> </w:t>
+      </w:r>
+      <w:r>
+        <w:rPr>
+          <w:bCs/>
+          <w:b/>
+        </w:rPr>
+        <w:t xml:space="preserve">Abyss</w:t>
+      </w:r>
+      <w:r>
+        <w:t xml:space="preserve">: a realm of no light and of eldritch powers, not a fiery hell. A true demon isn’t a creature of fire.</w:t>
+      </w:r>
+    </w:p>
+    <w:p>
+      <w:pPr>
+        <w:pStyle w:val="FirstParagraph"/>
+      </w:pPr>
+      <w:r>
+        <w:t xml:space="preserve">A</w:t>
+      </w:r>
+      <w:r>
+        <w:t xml:space="preserve"> </w:t>
+      </w:r>
+      <w:r>
+        <w:rPr>
+          <w:bCs/>
+          <w:b/>
+        </w:rPr>
+        <w:t xml:space="preserve">true demon can’t enter our world unaided</w:t>
+      </w:r>
+      <w:r>
+        <w:t xml:space="preserve">: it must be</w:t>
+      </w:r>
+      <w:r>
+        <w:t xml:space="preserve"> </w:t>
+      </w:r>
+      <w:r>
+        <w:rPr>
+          <w:bCs/>
+          <w:b/>
+        </w:rPr>
+        <w:t xml:space="preserve">summoned</w:t>
+      </w:r>
+      <w:r>
+        <w:t xml:space="preserve">, or come through a</w:t>
+      </w:r>
+      <w:r>
+        <w:t xml:space="preserve"> </w:t>
+      </w:r>
+      <w:r>
+        <w:rPr>
+          <w:bCs/>
+          <w:b/>
+        </w:rPr>
+        <w:t xml:space="preserve">possession</w:t>
+      </w:r>
+      <w:r>
+        <w:t xml:space="preserve">. A person can be possessed only if they are corrupted and have no faith of any kind at all. True demons are exceptionally powerful, and a generic fight is not how they are met: the encounter is a</w:t>
+      </w:r>
+      <w:r>
+        <w:t xml:space="preserve"> </w:t>
+      </w:r>
+      <w:r>
+        <w:rPr>
+          <w:bCs/>
+          <w:b/>
+        </w:rPr>
+        <w:t xml:space="preserve">ritual or a negotiation</w:t>
+      </w:r>
+      <w:r>
+        <w:t xml:space="preserve">, and the countermeasures are major rituals and powerful holy talismans.</w:t>
       </w:r>
     </w:p>
     <w:p>
       <w:pPr>
         <w:numPr>
           <w:ilvl w:val="0"/>
-          <w:numId w:val="1007"/>
+          <w:numId w:val="1008"/>
+        </w:numPr>
+        <w:pStyle w:val="Compact"/>
+      </w:pPr>
+      <w:r>
+        <w:rPr>
+          <w:bCs/>
+          <w:b/>
+        </w:rPr>
+        <w:t xml:space="preserve">Banishment by a talisman.</w:t>
+      </w:r>
+      <w:r>
+        <w:t xml:space="preserve"> </w:t>
+      </w:r>
+      <w:r>
+        <w:t xml:space="preserve">A sufficiently powerful holy talisman can banish a demon by breaking its binding to our world. What happens to the host depends on the talisman and how it acts: a holy sword that fatally wounds the host banishes the demon and kills the host.</w:t>
+      </w:r>
+    </w:p>
+    <w:p>
+      <w:pPr>
+        <w:numPr>
+          <w:ilvl w:val="0"/>
+          <w:numId w:val="1008"/>
+        </w:numPr>
+        <w:pStyle w:val="Compact"/>
+      </w:pPr>
+      <w:r>
+        <w:rPr>
+          <w:bCs/>
+          <w:b/>
+        </w:rPr>
+        <w:t xml:space="preserve">Banishment by ritual.</w:t>
+      </w:r>
+      <w:r>
+        <w:t xml:space="preserve"> </w:t>
+      </w:r>
+      <w:r>
+        <w:t xml:space="preserve">A properly completed banishment ritual preserves the host, if their body can survive without the demon holding it up.</w:t>
+      </w:r>
+    </w:p>
+    <w:p>
+      <w:pPr>
+        <w:numPr>
+          <w:ilvl w:val="0"/>
+          <w:numId w:val="1008"/>
+        </w:numPr>
+        <w:pStyle w:val="Compact"/>
+      </w:pPr>
+      <w:r>
+        <w:rPr>
+          <w:bCs/>
+          <w:b/>
+        </w:rPr>
+        <w:t xml:space="preserve">A possessed body.</w:t>
+      </w:r>
+      <w:r>
+        <w:t xml:space="preserve"> </w:t>
+      </w:r>
+      <w:r>
+        <w:t xml:space="preserve">A demon can keep a body moving through wounds that would otherwise be fatal, but possession heals nothing and grows nothing back. Ordinary injury to the body doesn’t kill the demon. This is not a vampire’s regeneration: when the demon goes, the body’s wounds are all still there.</w:t>
+      </w:r>
+    </w:p>
+    <w:p>
+      <w:pPr>
+        <w:numPr>
+          <w:ilvl w:val="0"/>
+          <w:numId w:val="1008"/>
         </w:numPr>
         <w:pStyle w:val="Compact"/>
       </w:pPr>
@@ -4944,7 +5162,7 @@
       <w:pPr>
         <w:numPr>
           <w:ilvl w:val="0"/>
-          <w:numId w:val="1008"/>
+          <w:numId w:val="1009"/>
         </w:numPr>
         <w:pStyle w:val="Compact"/>
       </w:pPr>
@@ -4960,280 +5178,6 @@
       </w:r>
       <w:r>
         <w:t xml:space="preserve">A lore card is earned when a discovery clock fills, or when the characters see or test something themselves, hear it from a source you judge reliable, or are told it by the subject itself with evidence to back it up. A guess, however right, isn’t established, and neither is a rumor. Ask what supports their idea; when the answer is good, let them act on it, and give the lore card once they’ve confirmed it.</w:t>
-      </w:r>
-    </w:p>
-    <w:p>
-      <w:pPr>
-        <w:numPr>
-          <w:ilvl w:val="0"/>
-          <w:numId w:val="1008"/>
-        </w:numPr>
-        <w:pStyle w:val="Compact"/>
-      </w:pPr>
-      <w:r>
-        <w:rPr>
-          <w:bCs/>
-          <w:b/>
-        </w:rPr>
-        <w:t xml:space="preserve">Write the finding narrowly.</w:t>
-      </w:r>
-      <w:r>
-        <w:t xml:space="preserve"> </w:t>
-      </w:r>
-      <w:r>
-        <w:t xml:space="preserve">One fact, in the words the characters would use, and no more than they found out:</w:t>
-      </w:r>
-      <w:r>
-        <w:t xml:space="preserve"> </w:t>
-      </w:r>
-      <w:r>
-        <w:t xml:space="preserve">“</w:t>
-      </w:r>
-      <w:r>
-        <w:t xml:space="preserve">bright light drove it back</w:t>
-      </w:r>
-      <w:r>
-        <w:t xml:space="preserve">”</w:t>
-      </w:r>
-      <w:r>
-        <w:t xml:space="preserve">, not</w:t>
-      </w:r>
-      <w:r>
-        <w:t xml:space="preserve"> </w:t>
-      </w:r>
-      <w:r>
-        <w:t xml:space="preserve">“</w:t>
-      </w:r>
-      <w:r>
-        <w:t xml:space="preserve">it fears light</w:t>
-      </w:r>
-      <w:r>
-        <w:t xml:space="preserve">”</w:t>
-      </w:r>
-      <w:r>
-        <w:t xml:space="preserve">. Two separate facts make two lore cards. Never write the subject’s whole truth onto a lore card; later discoveries add more lore cards.</w:t>
-      </w:r>
-    </w:p>
-    <w:p>
-      <w:pPr>
-        <w:numPr>
-          <w:ilvl w:val="0"/>
-          <w:numId w:val="1008"/>
-        </w:numPr>
-        <w:pStyle w:val="Compact"/>
-      </w:pPr>
-      <w:r>
-        <w:rPr>
-          <w:bCs/>
-          <w:b/>
-        </w:rPr>
-        <w:t xml:space="preserve">Write its limits.</w:t>
-      </w:r>
-      <w:r>
-        <w:t xml:space="preserve"> </w:t>
-      </w:r>
-      <w:r>
-        <w:t xml:space="preserve">What the finding doesn’t show: how often it was seen, under what conditions, and what is still unknown. The limits are what keep the next investigation interesting.</w:t>
-      </w:r>
-    </w:p>
-    <w:p>
-      <w:pPr>
-        <w:numPr>
-          <w:ilvl w:val="0"/>
-          <w:numId w:val="1008"/>
-        </w:numPr>
-        <w:pStyle w:val="Compact"/>
-      </w:pPr>
-      <w:r>
-        <w:rPr>
-          <w:bCs/>
-          <w:b/>
-        </w:rPr>
-        <w:t xml:space="preserve">Note the evidence or source.</w:t>
-      </w:r>
-      <w:r>
-        <w:t xml:space="preserve"> </w:t>
-      </w:r>
-      <w:r>
-        <w:t xml:space="preserve">What they saw, tested, read or were told, and by whom. A source’s reputation doesn’t make it right: if it was only probably true, the limits say so.</w:t>
-      </w:r>
-    </w:p>
-    <w:p>
-      <w:pPr>
-        <w:numPr>
-          <w:ilvl w:val="0"/>
-          <w:numId w:val="1008"/>
-        </w:numPr>
-        <w:pStyle w:val="Compact"/>
-      </w:pPr>
-      <w:r>
-        <w:rPr>
-          <w:bCs/>
-          <w:b/>
-        </w:rPr>
-        <w:t xml:space="preserve">Charge the price.</w:t>
-      </w:r>
-      <w:r>
-        <w:t xml:space="preserve"> </w:t>
-      </w:r>
-      <w:r>
-        <w:t xml:space="preserve">A lore card from a discovery clock costs nothing more: the scenes, failed rolls and pushes were its price. Any other source has its price (see</w:t>
-      </w:r>
-      <w:r>
-        <w:t xml:space="preserve"> </w:t>
-      </w:r>
-      <w:r>
-        <w:rPr>
-          <w:iCs/>
-          <w:i/>
-        </w:rPr>
-        <w:t xml:space="preserve">Earning a lore card</w:t>
-      </w:r>
-      <w:r>
-        <w:t xml:space="preserve">): choose the one that fits how they learned it, and mark it.</w:t>
-      </w:r>
-    </w:p>
-    <w:p>
-      <w:pPr>
-        <w:numPr>
-          <w:ilvl w:val="0"/>
-          <w:numId w:val="1008"/>
-        </w:numPr>
-        <w:pStyle w:val="Compact"/>
-      </w:pPr>
-      <w:r>
-        <w:rPr>
-          <w:bCs/>
-          <w:b/>
-        </w:rPr>
-        <w:t xml:space="preserve">Choose the owner and the recipients.</w:t>
-      </w:r>
-      <w:r>
-        <w:t xml:space="preserve"> </w:t>
-      </w:r>
-      <w:r>
-        <w:t xml:space="preserve">Whoever did the finding owns the lore card. Everyone who was there, or heard it from a reliable source, gets a shared copy.</w:t>
-      </w:r>
-    </w:p>
-    <w:p>
-      <w:pPr>
-        <w:numPr>
-          <w:ilvl w:val="0"/>
-          <w:numId w:val="1008"/>
-        </w:numPr>
-        <w:pStyle w:val="Compact"/>
-      </w:pPr>
-      <w:r>
-        <w:rPr>
-          <w:bCs/>
-          <w:b/>
-        </w:rPr>
-        <w:t xml:space="preserve">Record it.</w:t>
-      </w:r>
-      <w:r>
-        <w:t xml:space="preserve"> </w:t>
-      </w:r>
-      <w:r>
-        <w:t xml:space="preserve">In the GM view’s</w:t>
-      </w:r>
-      <w:r>
-        <w:t xml:space="preserve"> </w:t>
-      </w:r>
-      <w:r>
-        <w:rPr>
-          <w:bCs/>
-          <w:b/>
-        </w:rPr>
-        <w:t xml:space="preserve">Discovery</w:t>
-      </w:r>
-      <w:r>
-        <w:t xml:space="preserve"> </w:t>
-      </w:r>
-      <w:r>
-        <w:t xml:space="preserve">panel:</w:t>
-      </w:r>
-      <w:r>
-        <w:t xml:space="preserve"> </w:t>
-      </w:r>
-      <w:r>
-        <w:rPr>
-          <w:bCs/>
-          <w:b/>
-        </w:rPr>
-        <w:t xml:space="preserve">Mint</w:t>
-      </w:r>
-      <w:r>
-        <w:t xml:space="preserve"> </w:t>
-      </w:r>
-      <w:r>
-        <w:t xml:space="preserve">a full clock’s lore card, or use</w:t>
-      </w:r>
-      <w:r>
-        <w:t xml:space="preserve"> </w:t>
-      </w:r>
-      <w:r>
-        <w:rPr>
-          <w:bCs/>
-          <w:b/>
-        </w:rPr>
-        <w:t xml:space="preserve">Record a finding without a clock</w:t>
-      </w:r>
-      <w:r>
-        <w:t xml:space="preserve">, which marks the price for you. Then save everyone’s characters to file, so the players’ sheets carry it. A player can also write a lore card on their own sheet, when you agree it’s been earned.</w:t>
-      </w:r>
-    </w:p>
-    <w:p>
-      <w:pPr>
-        <w:pStyle w:val="FirstParagraph"/>
-      </w:pPr>
-      <w:r>
-        <w:rPr>
-          <w:iCs/>
-          <w:i/>
-        </w:rPr>
-        <w:t xml:space="preserve">Example:</w:t>
-      </w:r>
-      <w:r>
-        <w:t xml:space="preserve"> </w:t>
-      </w:r>
-      <w:r>
-        <w:rPr>
-          <w:bCs/>
-          <w:b/>
-        </w:rPr>
-        <w:t xml:space="preserve">Werewolf.</w:t>
-      </w:r>
-      <w:r>
-        <w:t xml:space="preserve"> </w:t>
-      </w:r>
-      <w:r>
-        <w:t xml:space="preserve">Established:</w:t>
-      </w:r>
-      <w:r>
-        <w:t xml:space="preserve"> </w:t>
-      </w:r>
-      <w:r>
-        <w:rPr>
-          <w:iCs/>
-          <w:i/>
-        </w:rPr>
-        <w:t xml:space="preserve">Silver buckshot made it bleed and run</w:t>
-      </w:r>
-      <w:r>
-        <w:t xml:space="preserve">. Limits:</w:t>
-      </w:r>
-      <w:r>
-        <w:t xml:space="preserve"> </w:t>
-      </w:r>
-      <w:r>
-        <w:rPr>
-          <w:iCs/>
-          <w:i/>
-        </w:rPr>
-        <w:t xml:space="preserve">One wolf, one night; not whether silver can kill it</w:t>
-      </w:r>
-      <w:r>
-        <w:t xml:space="preserve">. Source: Ruth Calloway’s shotgun at the Haskell barn (seen or tested firsthand). Cost: Harvest +1 (the night spent waiting for it).</w:t>
       </w:r>
     </w:p>
     <w:p>
@@ -5249,13 +5193,43 @@
           <w:bCs/>
           <w:b/>
         </w:rPr>
-        <w:t xml:space="preserve">When a later finding disagrees.</w:t>
-      </w:r>
-      <w:r>
-        <w:t xml:space="preserve"> </w:t>
-      </w:r>
-      <w:r>
-        <w:t xml:space="preserve">Write a new lore card that says what they now know; the old one stays on the sheet as what they believed then, and the new one’s limits can say so.</w:t>
+        <w:t xml:space="preserve">Write the finding narrowly.</w:t>
+      </w:r>
+      <w:r>
+        <w:t xml:space="preserve"> </w:t>
+      </w:r>
+      <w:r>
+        <w:t xml:space="preserve">One fact, in the words the characters would use, and no more than they found out:</w:t>
+      </w:r>
+      <w:r>
+        <w:t xml:space="preserve"> </w:t>
+      </w:r>
+      <w:r>
+        <w:t xml:space="preserve">“</w:t>
+      </w:r>
+      <w:r>
+        <w:t xml:space="preserve">bright light drove it back</w:t>
+      </w:r>
+      <w:r>
+        <w:t xml:space="preserve">”</w:t>
+      </w:r>
+      <w:r>
+        <w:t xml:space="preserve">, not</w:t>
+      </w:r>
+      <w:r>
+        <w:t xml:space="preserve"> </w:t>
+      </w:r>
+      <w:r>
+        <w:t xml:space="preserve">“</w:t>
+      </w:r>
+      <w:r>
+        <w:t xml:space="preserve">it fears light</w:t>
+      </w:r>
+      <w:r>
+        <w:t xml:space="preserve">”</w:t>
+      </w:r>
+      <w:r>
+        <w:t xml:space="preserve">. Two separate facts make two lore cards. Never write the subject’s whole truth onto a lore card; later discoveries add more lore cards.</w:t>
       </w:r>
     </w:p>
     <w:p>
@@ -5271,13 +5245,13 @@
           <w:bCs/>
           <w:b/>
         </w:rPr>
-        <w:t xml:space="preserve">A lore card is never proof of identity.</w:t>
-      </w:r>
-      <w:r>
-        <w:t xml:space="preserve"> </w:t>
-      </w:r>
-      <w:r>
-        <w:t xml:space="preserve">Holding a lore card about one subject doesn’t prove that the thing in front of them is that subject: the Identify phase does.</w:t>
+        <w:t xml:space="preserve">Write its limits.</w:t>
+      </w:r>
+      <w:r>
+        <w:t xml:space="preserve"> </w:t>
+      </w:r>
+      <w:r>
+        <w:t xml:space="preserve">What the finding doesn’t show: how often it was seen, under what conditions, and what is still unknown. The limits are what keep the next investigation interesting.</w:t>
       </w:r>
     </w:p>
     <w:p>
@@ -5285,6 +5259,250 @@
         <w:numPr>
           <w:ilvl w:val="0"/>
           <w:numId w:val="1009"/>
+        </w:numPr>
+        <w:pStyle w:val="Compact"/>
+      </w:pPr>
+      <w:r>
+        <w:rPr>
+          <w:bCs/>
+          <w:b/>
+        </w:rPr>
+        <w:t xml:space="preserve">Note the evidence or source.</w:t>
+      </w:r>
+      <w:r>
+        <w:t xml:space="preserve"> </w:t>
+      </w:r>
+      <w:r>
+        <w:t xml:space="preserve">What they saw, tested, read or were told, and by whom. A source’s reputation doesn’t make it right: if it was only probably true, the limits say so.</w:t>
+      </w:r>
+    </w:p>
+    <w:p>
+      <w:pPr>
+        <w:numPr>
+          <w:ilvl w:val="0"/>
+          <w:numId w:val="1009"/>
+        </w:numPr>
+        <w:pStyle w:val="Compact"/>
+      </w:pPr>
+      <w:r>
+        <w:rPr>
+          <w:bCs/>
+          <w:b/>
+        </w:rPr>
+        <w:t xml:space="preserve">Charge the price.</w:t>
+      </w:r>
+      <w:r>
+        <w:t xml:space="preserve"> </w:t>
+      </w:r>
+      <w:r>
+        <w:t xml:space="preserve">A lore card from a discovery clock costs nothing more: the scenes, failed rolls and pushes were its price. Any other source has its price (see</w:t>
+      </w:r>
+      <w:r>
+        <w:t xml:space="preserve"> </w:t>
+      </w:r>
+      <w:r>
+        <w:rPr>
+          <w:iCs/>
+          <w:i/>
+        </w:rPr>
+        <w:t xml:space="preserve">Earning a lore card</w:t>
+      </w:r>
+      <w:r>
+        <w:t xml:space="preserve">): choose the one that fits how they learned it, and mark it.</w:t>
+      </w:r>
+    </w:p>
+    <w:p>
+      <w:pPr>
+        <w:numPr>
+          <w:ilvl w:val="0"/>
+          <w:numId w:val="1009"/>
+        </w:numPr>
+        <w:pStyle w:val="Compact"/>
+      </w:pPr>
+      <w:r>
+        <w:rPr>
+          <w:bCs/>
+          <w:b/>
+        </w:rPr>
+        <w:t xml:space="preserve">Choose the owner and the recipients.</w:t>
+      </w:r>
+      <w:r>
+        <w:t xml:space="preserve"> </w:t>
+      </w:r>
+      <w:r>
+        <w:t xml:space="preserve">Whoever did the finding owns the lore card. Everyone who was there, or heard it from a reliable source, gets a shared copy.</w:t>
+      </w:r>
+    </w:p>
+    <w:p>
+      <w:pPr>
+        <w:numPr>
+          <w:ilvl w:val="0"/>
+          <w:numId w:val="1009"/>
+        </w:numPr>
+        <w:pStyle w:val="Compact"/>
+      </w:pPr>
+      <w:r>
+        <w:rPr>
+          <w:bCs/>
+          <w:b/>
+        </w:rPr>
+        <w:t xml:space="preserve">Record it.</w:t>
+      </w:r>
+      <w:r>
+        <w:t xml:space="preserve"> </w:t>
+      </w:r>
+      <w:r>
+        <w:t xml:space="preserve">In the GM view’s</w:t>
+      </w:r>
+      <w:r>
+        <w:t xml:space="preserve"> </w:t>
+      </w:r>
+      <w:r>
+        <w:rPr>
+          <w:bCs/>
+          <w:b/>
+        </w:rPr>
+        <w:t xml:space="preserve">Discovery</w:t>
+      </w:r>
+      <w:r>
+        <w:t xml:space="preserve"> </w:t>
+      </w:r>
+      <w:r>
+        <w:t xml:space="preserve">panel:</w:t>
+      </w:r>
+      <w:r>
+        <w:t xml:space="preserve"> </w:t>
+      </w:r>
+      <w:r>
+        <w:rPr>
+          <w:bCs/>
+          <w:b/>
+        </w:rPr>
+        <w:t xml:space="preserve">Mint</w:t>
+      </w:r>
+      <w:r>
+        <w:t xml:space="preserve"> </w:t>
+      </w:r>
+      <w:r>
+        <w:t xml:space="preserve">a full clock’s lore card, or use</w:t>
+      </w:r>
+      <w:r>
+        <w:t xml:space="preserve"> </w:t>
+      </w:r>
+      <w:r>
+        <w:rPr>
+          <w:bCs/>
+          <w:b/>
+        </w:rPr>
+        <w:t xml:space="preserve">Record a finding without a clock</w:t>
+      </w:r>
+      <w:r>
+        <w:t xml:space="preserve">, which marks the price for you. Then save everyone’s characters to file, so the players’ sheets carry it. A player can also write a lore card on their own sheet, when you agree it’s been earned.</w:t>
+      </w:r>
+    </w:p>
+    <w:p>
+      <w:pPr>
+        <w:pStyle w:val="FirstParagraph"/>
+      </w:pPr>
+      <w:r>
+        <w:rPr>
+          <w:iCs/>
+          <w:i/>
+        </w:rPr>
+        <w:t xml:space="preserve">Example:</w:t>
+      </w:r>
+      <w:r>
+        <w:t xml:space="preserve"> </w:t>
+      </w:r>
+      <w:r>
+        <w:rPr>
+          <w:bCs/>
+          <w:b/>
+        </w:rPr>
+        <w:t xml:space="preserve">Werewolf.</w:t>
+      </w:r>
+      <w:r>
+        <w:t xml:space="preserve"> </w:t>
+      </w:r>
+      <w:r>
+        <w:t xml:space="preserve">Established:</w:t>
+      </w:r>
+      <w:r>
+        <w:t xml:space="preserve"> </w:t>
+      </w:r>
+      <w:r>
+        <w:rPr>
+          <w:iCs/>
+          <w:i/>
+        </w:rPr>
+        <w:t xml:space="preserve">Silver buckshot made it bleed and run</w:t>
+      </w:r>
+      <w:r>
+        <w:t xml:space="preserve">. Limits:</w:t>
+      </w:r>
+      <w:r>
+        <w:t xml:space="preserve"> </w:t>
+      </w:r>
+      <w:r>
+        <w:rPr>
+          <w:iCs/>
+          <w:i/>
+        </w:rPr>
+        <w:t xml:space="preserve">One wolf, one night; not whether silver can kill it</w:t>
+      </w:r>
+      <w:r>
+        <w:t xml:space="preserve">. Source: Ruth Calloway’s shotgun at the Haskell barn (seen or tested firsthand). Cost: Harvest +1 (the night spent waiting for it).</w:t>
+      </w:r>
+    </w:p>
+    <w:p>
+      <w:pPr>
+        <w:numPr>
+          <w:ilvl w:val="0"/>
+          <w:numId w:val="1010"/>
+        </w:numPr>
+        <w:pStyle w:val="Compact"/>
+      </w:pPr>
+      <w:r>
+        <w:rPr>
+          <w:bCs/>
+          <w:b/>
+        </w:rPr>
+        <w:t xml:space="preserve">When a later finding disagrees.</w:t>
+      </w:r>
+      <w:r>
+        <w:t xml:space="preserve"> </w:t>
+      </w:r>
+      <w:r>
+        <w:t xml:space="preserve">Write a new lore card that says what they now know; the old one stays on the sheet as what they believed then, and the new one’s limits can say so.</w:t>
+      </w:r>
+    </w:p>
+    <w:p>
+      <w:pPr>
+        <w:numPr>
+          <w:ilvl w:val="0"/>
+          <w:numId w:val="1010"/>
+        </w:numPr>
+        <w:pStyle w:val="Compact"/>
+      </w:pPr>
+      <w:r>
+        <w:rPr>
+          <w:bCs/>
+          <w:b/>
+        </w:rPr>
+        <w:t xml:space="preserve">A lore card is never proof of identity.</w:t>
+      </w:r>
+      <w:r>
+        <w:t xml:space="preserve"> </w:t>
+      </w:r>
+      <w:r>
+        <w:t xml:space="preserve">Holding a lore card about one subject doesn’t prove that the thing in front of them is that subject: the Identify phase does.</w:t>
+      </w:r>
+    </w:p>
+    <w:p>
+      <w:pPr>
+        <w:numPr>
+          <w:ilvl w:val="0"/>
+          <w:numId w:val="1010"/>
         </w:numPr>
         <w:pStyle w:val="Compact"/>
       </w:pPr>
@@ -7436,7 +7654,7 @@
       <w:pPr>
         <w:numPr>
           <w:ilvl w:val="0"/>
-          <w:numId w:val="1010"/>
+          <w:numId w:val="1011"/>
         </w:numPr>
         <w:pStyle w:val="Compact"/>
       </w:pPr>
@@ -7465,232 +7683,6 @@
       </w:r>
       <w:r>
         <w:t xml:space="preserve">, so the GM can read the penalty from the Range table in the Players’ Guide. A token can have a height (a flier, a sniper on a roof), and the distance counts it.</w:t>
-      </w:r>
-    </w:p>
-    <w:p>
-      <w:pPr>
-        <w:numPr>
-          <w:ilvl w:val="0"/>
-          <w:numId w:val="1010"/>
-        </w:numPr>
-        <w:pStyle w:val="Compact"/>
-      </w:pPr>
-      <w:r>
-        <w:rPr>
-          <w:bCs/>
-          <w:b/>
-        </w:rPr>
-        <w:t xml:space="preserve">A range track</w:t>
-      </w:r>
-      <w:r>
-        <w:t xml:space="preserve"> </w:t>
-      </w:r>
-      <w:r>
-        <w:t xml:space="preserve">for fights where only distance matters: a chase, a running fight across open country. It has a lane for the posse and one for each range band. Moving a token into the next lane moves it one band in or out.</w:t>
-      </w:r>
-    </w:p>
-    <w:p>
-      <w:pPr>
-        <w:pStyle w:val="FirstParagraph"/>
-      </w:pPr>
-      <w:r>
-        <w:rPr>
-          <w:bCs/>
-          <w:b/>
-        </w:rPr>
-        <w:t xml:space="preserve">Tokens.</w:t>
-      </w:r>
-      <w:r>
-        <w:t xml:space="preserve"> </w:t>
-      </w:r>
-      <w:r>
-        <w:t xml:space="preserve">The GM places the posse with one button. Their tokens stay linked to the characters in the GM view: marking Injury, Dying, the stunned condition or a Grit point on a token marks it on the character, and the other way round. Opponents come from the setting’s threats with their boxes filled in. Their pips fill as they are hurt, and a token whose boxes are all marked is taken out.</w:t>
-      </w:r>
-    </w:p>
-    <w:p>
-      <w:pPr>
-        <w:pStyle w:val="BodyText"/>
-      </w:pPr>
-      <w:r>
-        <w:rPr>
-          <w:bCs/>
-          <w:b/>
-        </w:rPr>
-        <w:t xml:space="preserve">Keeping a map.</w:t>
-      </w:r>
-      <w:r>
-        <w:t xml:space="preserve"> </w:t>
-      </w:r>
-      <w:r>
-        <w:t xml:space="preserve">The map stays in the GM’s browser.</w:t>
-      </w:r>
-      <w:r>
-        <w:t xml:space="preserve"> </w:t>
-      </w:r>
-      <w:r>
-        <w:rPr>
-          <w:bCs/>
-          <w:b/>
-        </w:rPr>
-        <w:t xml:space="preserve">Save map to file</w:t>
-      </w:r>
-      <w:r>
-        <w:t xml:space="preserve"> </w:t>
-      </w:r>
-      <w:r>
-        <w:t xml:space="preserve">keeps both maps, their pictures and tokens in one file, to prepare a fight ahead of time or share it with another GM.</w:t>
-      </w:r>
-    </w:p>
-    <w:p>
-      <w:pPr>
-        <w:pStyle w:val="BodyText"/>
-      </w:pPr>
-      <w:r>
-        <w:rPr>
-          <w:bCs/>
-          <w:b/>
-        </w:rPr>
-        <w:t xml:space="preserve">Stagecoach chase.</w:t>
-      </w:r>
-      <w:r>
-        <w:t xml:space="preserve"> </w:t>
-      </w:r>
-      <w:r>
-        <w:t xml:space="preserve">Besides the plain range track, the map has a</w:t>
-      </w:r>
-      <w:r>
-        <w:t xml:space="preserve"> </w:t>
-      </w:r>
-      <w:r>
-        <w:rPr>
-          <w:bCs/>
-          <w:b/>
-        </w:rPr>
-        <w:t xml:space="preserve">Stagecoach chase</w:t>
-      </w:r>
-      <w:r>
-        <w:t xml:space="preserve"> </w:t>
-      </w:r>
-      <w:r>
-        <w:t xml:space="preserve">track.</w:t>
-      </w:r>
-      <w:r>
-        <w:t xml:space="preserve"> </w:t>
-      </w:r>
-      <w:r>
-        <w:rPr>
-          <w:bCs/>
-          <w:b/>
-        </w:rPr>
-        <w:t xml:space="preserve">Add the stagecoach</w:t>
-      </w:r>
-      <w:r>
-        <w:t xml:space="preserve"> </w:t>
-      </w:r>
-      <w:r>
-        <w:t xml:space="preserve">places the stagecoach in the first lane with its own Coach boxes; its panel shows what the damage does. The rules are under</w:t>
-      </w:r>
-      <w:r>
-        <w:t xml:space="preserve"> </w:t>
-      </w:r>
-      <w:r>
-        <w:rPr>
-          <w:iCs/>
-          <w:i/>
-        </w:rPr>
-        <w:t xml:space="preserve">Stagecoach chases</w:t>
-      </w:r>
-      <w:r>
-        <w:t xml:space="preserve"> </w:t>
-      </w:r>
-      <w:r>
-        <w:t xml:space="preserve">in the Players’ Guide.</w:t>
-      </w:r>
-    </w:p>
-    <w:bookmarkEnd w:id="38"/>
-    <w:bookmarkStart w:id="39" w:name="the-encounter-panel"/>
-    <w:p>
-      <w:pPr>
-        <w:pStyle w:val="Heading2"/>
-      </w:pPr>
-      <w:r>
-        <w:t xml:space="preserve">The Encounter panel</w:t>
-      </w:r>
-    </w:p>
-    <w:p>
-      <w:pPr>
-        <w:pStyle w:val="FirstParagraph"/>
-      </w:pPr>
-      <w:r>
-        <w:t xml:space="preserve">The GM view also has an</w:t>
-      </w:r>
-      <w:r>
-        <w:t xml:space="preserve"> </w:t>
-      </w:r>
-      <w:r>
-        <w:rPr>
-          <w:bCs/>
-          <w:b/>
-        </w:rPr>
-        <w:t xml:space="preserve">Encounter</w:t>
-      </w:r>
-      <w:r>
-        <w:t xml:space="preserve"> </w:t>
-      </w:r>
-      <w:r>
-        <w:t xml:space="preserve">panel that runs a fight by the</w:t>
-      </w:r>
-      <w:r>
-        <w:t xml:space="preserve"> </w:t>
-      </w:r>
-      <w:r>
-        <w:rPr>
-          <w:iCs/>
-          <w:i/>
-        </w:rPr>
-        <w:t xml:space="preserve">Personal combat</w:t>
-      </w:r>
-      <w:r>
-        <w:t xml:space="preserve"> </w:t>
-      </w:r>
-      <w:r>
-        <w:t xml:space="preserve">rules and shows every roll. Add characters from the GM view and opponents from the Threats table (or make one up on the spot), then start: it keeps the turn order by Agility, and for each attack works out the range, the defense (Dodge, Parry or Block, one a round, and a second at −2 with Additional Defense), the boxes marked and any telling hit, offering a Grit point choices at the moment they apply. Hits land on the character cards and the battle map, and with gritty combat on, grievous wounds are rolled and kept. The panel keeps a log and a summary of the fight, which can be saved to a file. It’s a helper, not a rule: the GM can rule any result differently, and the log says so. For each attack, choose what it’s made of (silver, cold iron, a wooden stake, fire, rock salt or blessed), and the panel applies the rules that turn on it: a shapechanger’s Tough in their form (and what gets past it), a weakness that marks one box more, and a creature only the right weapon can hurt.</w:t>
-      </w:r>
-    </w:p>
-    <w:p>
-      <w:pPr>
-        <w:pStyle w:val="BodyText"/>
-      </w:pPr>
-      <w:r>
-        <w:rPr>
-          <w:bCs/>
-          <w:b/>
-        </w:rPr>
-        <w:t xml:space="preserve">The shared table.</w:t>
-      </w:r>
-      <w:r>
-        <w:t xml:space="preserve"> </w:t>
-      </w:r>
-      <w:r>
-        <w:t xml:space="preserve">The GM can start a shared table from the GM view and give the players its code; each player joins from their character’s Ride tab. While they’re connected, every roll from a sheet is rolled by the table server, so the whole table sees the same dice as they land, in a live log on the Ride tab and on the GM view, along with who rolled, against what, and any telling hit. A point reroll answers its own roll, once. Each player’s character is shared with the GM too: it appears among the GM view’s characters, marked at the table, and its injuries, points, ammunition and form stay in step both ways, whether they’re changed on the sheet, on the GM’s card or in an encounter. In a fight, each player’s Ride tab shows the GM’s battle map and the encounter’s turn order and latest results; a player drags their own token, and on their turn sends the GM what they’ll do, which the GM puts into the Encounter panel and runs. The GM can remove a player from the table, and give the table a new code: everyone at it moves with it, and the old code stops working. Without a table, the roller works exactly as it always has.</w:t>
-      </w:r>
-    </w:p>
-    <w:bookmarkEnd w:id="39"/>
-    <w:bookmarkStart w:id="40" w:name="towns-strangers-and-the-frontier-tools"/>
-    <w:p>
-      <w:pPr>
-        <w:pStyle w:val="Heading2"/>
-      </w:pPr>
-      <w:r>
-        <w:t xml:space="preserve">Towns, strangers and the frontier tools</w:t>
-      </w:r>
-    </w:p>
-    <w:p>
-      <w:pPr>
-        <w:pStyle w:val="FirstParagraph"/>
-      </w:pPr>
-      <w:r>
-        <w:t xml:space="preserve">The GM view has tools made for the frontier:</w:t>
       </w:r>
     </w:p>
     <w:p>
@@ -7706,20 +7698,224 @@
           <w:bCs/>
           <w:b/>
         </w:rPr>
-        <w:t xml:space="preserve">The Campaign tab’s generators</w:t>
-      </w:r>
-      <w:r>
-        <w:t xml:space="preserve"> </w:t>
-      </w:r>
-      <w:r>
-        <w:t xml:space="preserve">roll from Trails’ own tables. A rolled place is half the time a frontier town: its name, what it lives on, who runs it, and what’s wrong there (the secret). A rolled person gets a frontier manner, a want and a secret.</w:t>
+        <w:t xml:space="preserve">A range track</w:t>
+      </w:r>
+      <w:r>
+        <w:t xml:space="preserve"> </w:t>
+      </w:r>
+      <w:r>
+        <w:t xml:space="preserve">for fights where only distance matters: a chase, a running fight across open country. It has a lane for the posse and one for each range band. Moving a token into the next lane moves it one band in or out.</w:t>
+      </w:r>
+    </w:p>
+    <w:p>
+      <w:pPr>
+        <w:pStyle w:val="FirstParagraph"/>
+      </w:pPr>
+      <w:r>
+        <w:rPr>
+          <w:bCs/>
+          <w:b/>
+        </w:rPr>
+        <w:t xml:space="preserve">Tokens.</w:t>
+      </w:r>
+      <w:r>
+        <w:t xml:space="preserve"> </w:t>
+      </w:r>
+      <w:r>
+        <w:t xml:space="preserve">The GM places the posse with one button. Their tokens stay linked to the characters in the GM view: marking Injury, Dying, the stunned condition or a Grit point on a token marks it on the character, and the other way round. Opponents come from the setting’s threats with their boxes filled in. Their pips fill as they are hurt, and a token whose boxes are all marked is taken out.</w:t>
+      </w:r>
+    </w:p>
+    <w:p>
+      <w:pPr>
+        <w:pStyle w:val="BodyText"/>
+      </w:pPr>
+      <w:r>
+        <w:rPr>
+          <w:bCs/>
+          <w:b/>
+        </w:rPr>
+        <w:t xml:space="preserve">Keeping a map.</w:t>
+      </w:r>
+      <w:r>
+        <w:t xml:space="preserve"> </w:t>
+      </w:r>
+      <w:r>
+        <w:t xml:space="preserve">The map stays in the GM’s browser.</w:t>
+      </w:r>
+      <w:r>
+        <w:t xml:space="preserve"> </w:t>
+      </w:r>
+      <w:r>
+        <w:rPr>
+          <w:bCs/>
+          <w:b/>
+        </w:rPr>
+        <w:t xml:space="preserve">Save map to file</w:t>
+      </w:r>
+      <w:r>
+        <w:t xml:space="preserve"> </w:t>
+      </w:r>
+      <w:r>
+        <w:t xml:space="preserve">keeps both maps, their pictures and tokens in one file, to prepare a fight ahead of time or share it with another GM.</w:t>
+      </w:r>
+    </w:p>
+    <w:p>
+      <w:pPr>
+        <w:pStyle w:val="BodyText"/>
+      </w:pPr>
+      <w:r>
+        <w:rPr>
+          <w:bCs/>
+          <w:b/>
+        </w:rPr>
+        <w:t xml:space="preserve">Stagecoach chase.</w:t>
+      </w:r>
+      <w:r>
+        <w:t xml:space="preserve"> </w:t>
+      </w:r>
+      <w:r>
+        <w:t xml:space="preserve">Besides the plain range track, the map has a</w:t>
+      </w:r>
+      <w:r>
+        <w:t xml:space="preserve"> </w:t>
+      </w:r>
+      <w:r>
+        <w:rPr>
+          <w:bCs/>
+          <w:b/>
+        </w:rPr>
+        <w:t xml:space="preserve">Stagecoach chase</w:t>
+      </w:r>
+      <w:r>
+        <w:t xml:space="preserve"> </w:t>
+      </w:r>
+      <w:r>
+        <w:t xml:space="preserve">track.</w:t>
+      </w:r>
+      <w:r>
+        <w:t xml:space="preserve"> </w:t>
+      </w:r>
+      <w:r>
+        <w:rPr>
+          <w:bCs/>
+          <w:b/>
+        </w:rPr>
+        <w:t xml:space="preserve">Add the stagecoach</w:t>
+      </w:r>
+      <w:r>
+        <w:t xml:space="preserve"> </w:t>
+      </w:r>
+      <w:r>
+        <w:t xml:space="preserve">places the stagecoach in the first lane with its own Coach boxes; its panel shows what the damage does. The rules are under</w:t>
+      </w:r>
+      <w:r>
+        <w:t xml:space="preserve"> </w:t>
+      </w:r>
+      <w:r>
+        <w:rPr>
+          <w:iCs/>
+          <w:i/>
+        </w:rPr>
+        <w:t xml:space="preserve">Stagecoach chases</w:t>
+      </w:r>
+      <w:r>
+        <w:t xml:space="preserve"> </w:t>
+      </w:r>
+      <w:r>
+        <w:t xml:space="preserve">in the Players’ Guide.</w:t>
+      </w:r>
+    </w:p>
+    <w:bookmarkEnd w:id="38"/>
+    <w:bookmarkStart w:id="39" w:name="the-encounter-panel"/>
+    <w:p>
+      <w:pPr>
+        <w:pStyle w:val="Heading2"/>
+      </w:pPr>
+      <w:r>
+        <w:t xml:space="preserve">The Encounter panel</w:t>
+      </w:r>
+    </w:p>
+    <w:p>
+      <w:pPr>
+        <w:pStyle w:val="FirstParagraph"/>
+      </w:pPr>
+      <w:r>
+        <w:t xml:space="preserve">The GM view also has an</w:t>
+      </w:r>
+      <w:r>
+        <w:t xml:space="preserve"> </w:t>
+      </w:r>
+      <w:r>
+        <w:rPr>
+          <w:bCs/>
+          <w:b/>
+        </w:rPr>
+        <w:t xml:space="preserve">Encounter</w:t>
+      </w:r>
+      <w:r>
+        <w:t xml:space="preserve"> </w:t>
+      </w:r>
+      <w:r>
+        <w:t xml:space="preserve">panel that runs a fight by the</w:t>
+      </w:r>
+      <w:r>
+        <w:t xml:space="preserve"> </w:t>
+      </w:r>
+      <w:r>
+        <w:rPr>
+          <w:iCs/>
+          <w:i/>
+        </w:rPr>
+        <w:t xml:space="preserve">Personal combat</w:t>
+      </w:r>
+      <w:r>
+        <w:t xml:space="preserve"> </w:t>
+      </w:r>
+      <w:r>
+        <w:t xml:space="preserve">rules and shows every roll. Add characters from the GM view and opponents from the Threats table (or make one up on the spot), then start: it keeps the turn order by Agility, and for each attack works out the range, the defense (Dodge, Parry or Block, one a round, and a second at −2 with Additional Defense), the boxes marked and any telling hit, offering a Grit point choices at the moment they apply. Hits land on the character cards and the battle map, and with gritty combat on, grievous wounds are rolled and kept. The panel keeps a log and a summary of the fight, which can be saved to a file. It’s a helper, not a rule: the GM can rule any result differently, and the log says so. For each attack, choose what it’s made of (silver, cold iron, a wooden stake, fire, rock salt or blessed), and the panel applies the rules that turn on it: a shapechanger’s Tough in their form (and what gets past it), a weakness that marks one box more, and a creature only the right weapon can hurt.</w:t>
+      </w:r>
+    </w:p>
+    <w:p>
+      <w:pPr>
+        <w:pStyle w:val="BodyText"/>
+      </w:pPr>
+      <w:r>
+        <w:rPr>
+          <w:bCs/>
+          <w:b/>
+        </w:rPr>
+        <w:t xml:space="preserve">The shared table.</w:t>
+      </w:r>
+      <w:r>
+        <w:t xml:space="preserve"> </w:t>
+      </w:r>
+      <w:r>
+        <w:t xml:space="preserve">The GM can start a shared table from the GM view and give the players its code; each player joins from their character’s Ride tab. While they’re connected, every roll from a sheet is rolled by the table server, so the whole table sees the same dice as they land, in a live log on the Ride tab and on the GM view, along with who rolled, against what, and any telling hit. A point reroll answers its own roll, once. Each player’s character is shared with the GM too: it appears among the GM view’s characters, marked at the table, and its injuries, points, ammunition and form stay in step both ways, whether they’re changed on the sheet, on the GM’s card or in an encounter. In a fight, each player’s Ride tab shows the GM’s battle map and the encounter’s turn order and latest results; a player drags their own token, and on their turn sends the GM what they’ll do, which the GM puts into the Encounter panel and runs. The GM can remove a player from the table, and give the table a new code: everyone at it moves with it, and the old code stops working. Without a table, the roller works exactly as it always has.</w:t>
+      </w:r>
+    </w:p>
+    <w:bookmarkEnd w:id="39"/>
+    <w:bookmarkStart w:id="40" w:name="towns-strangers-and-the-frontier-tools"/>
+    <w:p>
+      <w:pPr>
+        <w:pStyle w:val="Heading2"/>
+      </w:pPr>
+      <w:r>
+        <w:t xml:space="preserve">Towns, strangers and the frontier tools</w:t>
+      </w:r>
+    </w:p>
+    <w:p>
+      <w:pPr>
+        <w:pStyle w:val="FirstParagraph"/>
+      </w:pPr>
+      <w:r>
+        <w:t xml:space="preserve">The GM view has tools made for the frontier:</w:t>
       </w:r>
     </w:p>
     <w:p>
       <w:pPr>
         <w:numPr>
           <w:ilvl w:val="0"/>
-          <w:numId w:val="1011"/>
+          <w:numId w:val="1012"/>
         </w:numPr>
         <w:pStyle w:val="Compact"/>
       </w:pPr>
@@ -7728,6 +7924,28 @@
           <w:bCs/>
           <w:b/>
         </w:rPr>
+        <w:t xml:space="preserve">The Campaign tab’s generators</w:t>
+      </w:r>
+      <w:r>
+        <w:t xml:space="preserve"> </w:t>
+      </w:r>
+      <w:r>
+        <w:t xml:space="preserve">roll from Trails’ own tables. A rolled place is half the time a frontier town: its name, what it lives on, who runs it, and what’s wrong there (the secret). A rolled person gets a frontier manner, a want and a secret.</w:t>
+      </w:r>
+    </w:p>
+    <w:p>
+      <w:pPr>
+        <w:numPr>
+          <w:ilvl w:val="0"/>
+          <w:numId w:val="1012"/>
+        </w:numPr>
+        <w:pStyle w:val="Compact"/>
+      </w:pPr>
+      <w:r>
+        <w:rPr>
+          <w:bCs/>
+          <w:b/>
+        </w:rPr>
         <w:t xml:space="preserve">Wanted posters</w:t>
       </w:r>
       <w:r>
@@ -7786,7 +8004,7 @@
       <w:pPr>
         <w:numPr>
           <w:ilvl w:val="0"/>
-          <w:numId w:val="1011"/>
+          <w:numId w:val="1012"/>
         </w:numPr>
         <w:pStyle w:val="Compact"/>
       </w:pPr>
@@ -7837,7 +8055,7 @@
       <w:pPr>
         <w:numPr>
           <w:ilvl w:val="0"/>
-          <w:numId w:val="1011"/>
+          <w:numId w:val="1012"/>
         </w:numPr>
         <w:pStyle w:val="Compact"/>
       </w:pPr>
@@ -8181,6 +8399,9 @@
     <w:abstractNumId w:val="991"/>
   </w:num>
   <w:num w:numId="1008">
+    <w:abstractNumId w:val="991"/>
+  </w:num>
+  <w:num w:numId="1009">
     <w:abstractNumId w:val="99411"/>
     <w:lvlOverride w:ilvl="0">
       <w:startOverride w:val="1"/>
@@ -8210,13 +8431,13 @@
       <w:startOverride w:val="1"/>
     </w:lvlOverride>
   </w:num>
-  <w:num w:numId="1009">
-    <w:abstractNumId w:val="991"/>
-  </w:num>
   <w:num w:numId="1010">
     <w:abstractNumId w:val="991"/>
   </w:num>
   <w:num w:numId="1011">
+    <w:abstractNumId w:val="991"/>
+  </w:num>
+  <w:num w:numId="1012">
     <w:abstractNumId w:val="991"/>
   </w:num>
 </w:numbering>

</xml_diff>